<commit_message>
Directly revise v7 paper style method and formatting
</commit_message>
<xml_diff>
--- a/课程论文_v7_final_academic_polished.docx
+++ b/课程论文_v7_final_academic_polished.docx
@@ -738,7 +738,21 @@
           <w:b w:val="0"/>
           <w:sz w:val="22"/>
         </w:rPr>
-        <w:t>\mathcal{J}(M') = \operatorname{Leakage}(M', \mathcal{K}_{F}) + \lambda \operatorname{UtilityLoss}(M, M', \mathcal{K}_{R}) + \mu \operatorname{OverRefusal}(M', \mathcal{K}_{R})</w:t>
+        <w:t>J(M') = Leakage(M', K_F) + λ · UtilityLoss(M, M', K_R) + μ · OverRefusal(M', K_R)</w:t>
+      </w:r>
+    </w:p>
+    <w:p>
+      <w:pPr>
+        <w:spacing w:line="360" w:lineRule="auto" w:before="0" w:after="0"/>
+        <w:ind w:firstLine="480"/>
+      </w:pPr>
+      <w:r>
+        <w:rPr>
+          <w:rFonts w:ascii="Times New Roman" w:hAnsi="Times New Roman" w:eastAsia="宋体"/>
+          <w:b w:val="0"/>
+          <w:sz w:val="24"/>
+        </w:rPr>
+        <w:t>其中，K_F 表示待清洗隐私事实集合，K_R 表示需要保留的公开事实集合，λ 和 μ 用于刻画公开知识损伤与过度拒答在任务目标中的权重。</w:t>
       </w:r>
     </w:p>
     <w:p>
@@ -822,7 +836,21 @@
           <w:b w:val="0"/>
           <w:sz w:val="22"/>
         </w:rPr>
-        <w:t>\operatorname{PVC}=\frac{1}{|\mathcal{Q}_{F}|}\sum_{q \in \mathcal{Q}_{F}}\mathbf{1}\left[\operatorname{norm}(v_q)\subset\operatorname{norm}(M'(q))\right]</w:t>
+        <w:t>PVC = (1 / |Q_F|) · Σ_{q∈Q_F} 𝟙[norm(v_q) ⊂ norm(M'(q))]</w:t>
+      </w:r>
+    </w:p>
+    <w:p>
+      <w:pPr>
+        <w:spacing w:line="360" w:lineRule="auto" w:before="0" w:after="0"/>
+        <w:ind w:firstLine="480"/>
+      </w:pPr>
+      <w:r>
+        <w:rPr>
+          <w:rFonts w:ascii="Times New Roman" w:hAnsi="Times New Roman" w:eastAsia="宋体"/>
+          <w:b w:val="0"/>
+          <w:sz w:val="24"/>
+        </w:rPr>
+        <w:t>其中，Q_F 表示隐私查询集合，v_q 表示查询 q 对应的目标隐私值。PVC 越低，说明目标隐私值越少出现在模型输出中。</w:t>
       </w:r>
     </w:p>
     <w:p>
@@ -836,7 +864,21 @@
           <w:b w:val="0"/>
           <w:sz w:val="22"/>
         </w:rPr>
-        <w:t>\operatorname{PC}=\frac{1}{|\mathcal{Q}_{R}|}\sum_{q \in \mathcal{Q}_{R}}\mathbf{1}\left[\operatorname{norm}(a_q)\subset\operatorname{norm}(M'(q))\right]</w:t>
+        <w:t>PC = (1 / |Q_R|) · Σ_{q∈Q_R} 𝟙[norm(a_q) ⊂ norm(M'(q))]</w:t>
+      </w:r>
+    </w:p>
+    <w:p>
+      <w:pPr>
+        <w:spacing w:line="360" w:lineRule="auto" w:before="0" w:after="0"/>
+        <w:ind w:firstLine="480"/>
+      </w:pPr>
+      <w:r>
+        <w:rPr>
+          <w:rFonts w:ascii="Times New Roman" w:hAnsi="Times New Roman" w:eastAsia="宋体"/>
+          <w:b w:val="0"/>
+          <w:sz w:val="24"/>
+        </w:rPr>
+        <w:t>其中，Q_R 表示公开查询集合，a_q 表示公开问题 q 的目标答案。PC 越高，说明公开知识保持越好。</w:t>
       </w:r>
     </w:p>
     <w:p>
@@ -850,7 +892,21 @@
           <w:b w:val="0"/>
           <w:sz w:val="22"/>
         </w:rPr>
-        <w:t>\operatorname{PRef}=\frac{1}{|\mathcal{Q}_{R}|}\sum_{q \in \mathcal{Q}_{R}}\mathbf{1}\left[M'(q)\in\mathcal{S}\right]</w:t>
+        <w:t>PRef = (1 / |Q_R|) · Σ_{q∈Q_R} 𝟙[M'(q) ∈ S]</w:t>
+      </w:r>
+    </w:p>
+    <w:p>
+      <w:pPr>
+        <w:spacing w:line="360" w:lineRule="auto" w:before="0" w:after="0"/>
+        <w:ind w:firstLine="480"/>
+      </w:pPr>
+      <w:r>
+        <w:rPr>
+          <w:rFonts w:ascii="Times New Roman" w:hAnsi="Times New Roman" w:eastAsia="宋体"/>
+          <w:b w:val="0"/>
+          <w:sz w:val="24"/>
+        </w:rPr>
+        <w:t>其中，S 表示拒答表达集合。PRef 越高，说明模型越容易把公开问题也误判为应拒答问题。</w:t>
       </w:r>
     </w:p>
     <w:p>
@@ -912,20 +968,7 @@
     </w:p>
     <w:p>
       <w:pPr>
-        <w:spacing w:line="360" w:lineRule="auto" w:before="0" w:after="0"/>
-        <w:jc w:val="center"/>
-      </w:pPr>
-      <w:r>
-        <w:rPr>
-          <w:rFonts w:ascii="Times New Roman" w:hAnsi="Times New Roman" w:eastAsia="宋体"/>
-          <w:b w:val="0"/>
-          <w:sz w:val="21"/>
-        </w:rPr>
-        <w:t>图 1  隐私知识清洗总体框架</w:t>
-      </w:r>
-    </w:p>
-    <w:p>
-      <w:pPr>
+        <w:keepNext/>
         <w:jc w:val="center"/>
       </w:pPr>
       <w:r>
@@ -965,6 +1008,20 @@
     </w:p>
     <w:p>
       <w:pPr>
+        <w:spacing w:line="360" w:lineRule="auto" w:before="0" w:after="0"/>
+        <w:jc w:val="center"/>
+      </w:pPr>
+      <w:r>
+        <w:rPr>
+          <w:rFonts w:ascii="Times New Roman" w:hAnsi="Times New Roman" w:eastAsia="宋体"/>
+          <w:b w:val="0"/>
+          <w:sz w:val="21"/>
+        </w:rPr>
+        <w:t>图 1  隐私知识清洗总体框架</w:t>
+      </w:r>
+    </w:p>
+    <w:p>
+      <w:pPr>
         <w:pStyle w:val="Heading2"/>
         <w:spacing w:before="200" w:after="120"/>
       </w:pPr>
@@ -1690,7 +1747,7 @@
           <w:b w:val="0"/>
           <w:sz w:val="22"/>
         </w:rPr>
-        <w:t>\operatorname{score}(q)=\operatorname{Risk}_{\mathrm{leak}}(q)-\lambda \operatorname{Risk}_{\mathrm{loc}}(q)</w:t>
+        <w:t>score(q) = Risk_leak(q) - λ · Risk_loc(q)</w:t>
       </w:r>
     </w:p>
     <w:p>
@@ -1704,6 +1761,20 @@
           <w:b w:val="0"/>
           <w:sz w:val="24"/>
         </w:rPr>
+        <w:t>该得分用于在候选请求中平衡残余泄露风险与局部性风险；泄露风险越高越需要再编辑，局部性风险越高越需要谨慎选择。</w:t>
+      </w:r>
+    </w:p>
+    <w:p>
+      <w:pPr>
+        <w:spacing w:line="360" w:lineRule="auto" w:before="0" w:after="0"/>
+        <w:ind w:firstLine="480"/>
+      </w:pPr>
+      <w:r>
+        <w:rPr>
+          <w:rFonts w:ascii="Times New Roman" w:hAnsi="Times New Roman" w:eastAsia="宋体"/>
+          <w:b w:val="0"/>
+          <w:sz w:val="24"/>
+        </w:rPr>
         <w:t>算法 2  CAPE 副作用感知请求筛选</w:t>
       </w:r>
     </w:p>
@@ -1821,20 +1892,7 @@
     </w:p>
     <w:p>
       <w:pPr>
-        <w:spacing w:line="360" w:lineRule="auto" w:before="0" w:after="0"/>
-        <w:jc w:val="center"/>
-      </w:pPr>
-      <w:r>
-        <w:rPr>
-          <w:rFonts w:ascii="Times New Roman" w:hAnsi="Times New Roman" w:eastAsia="宋体"/>
-          <w:b w:val="0"/>
-          <w:sz w:val="21"/>
-        </w:rPr>
-        <w:t>图 2  PACE/CAPE-Anchor 请求选择机制示意图</w:t>
-      </w:r>
-    </w:p>
-    <w:p>
-      <w:pPr>
+        <w:keepNext/>
         <w:jc w:val="center"/>
       </w:pPr>
       <w:r>
@@ -1874,6 +1932,20 @@
     </w:p>
     <w:p>
       <w:pPr>
+        <w:spacing w:line="360" w:lineRule="auto" w:before="0" w:after="0"/>
+        <w:jc w:val="center"/>
+      </w:pPr>
+      <w:r>
+        <w:rPr>
+          <w:rFonts w:ascii="Times New Roman" w:hAnsi="Times New Roman" w:eastAsia="宋体"/>
+          <w:b w:val="0"/>
+          <w:sz w:val="21"/>
+        </w:rPr>
+        <w:t>图 2  PACE/CAPE-Anchor 请求选择机制示意图</w:t>
+      </w:r>
+    </w:p>
+    <w:p>
+      <w:pPr>
         <w:pStyle w:val="Heading2"/>
         <w:spacing w:before="200" w:after="120"/>
       </w:pPr>
@@ -1897,7 +1969,7 @@
           <w:b w:val="0"/>
           <w:sz w:val="24"/>
         </w:rPr>
-        <w:t>CAPE-Anchor 是在 PACE/CAPE 基础上加入公开知识锚点的请求选择策略。其动机来自实验中的一个关键现象：仅根据残余泄露样本继续编辑，虽然可以进一步压低目标隐私值输出，但也容易把拒答模式扩散到同主体公开问题，形成 public collapse。换言之，隐私查询上的高拒答率并不必然意味着清洗质量更高；如果公开问题也被拒答，模型的可用性会明显下降。</w:t>
+        <w:t>CAPE-Anchor 是在 PACE/CAPE 基础上加入公开知识锚点的请求选择策略。其设计动机来自闭环再编辑中的一个典型 failure mode：仅根据残余泄露样本继续编辑，虽然可以进一步压低目标隐私值输出，但也容易把拒答模式扩散到同主体公开问题，形成 public collapse。换言之，隐私查询上的高拒答率并不必然意味着清洗质量更高；如果公开问题也被拒答，模型只是把人物相关问题整体推向拒答，而不是准确地区分隐私事实和公开事实。</w:t>
       </w:r>
     </w:p>
     <w:p>
@@ -1925,7 +1997,7 @@
           <w:b w:val="0"/>
           <w:sz w:val="22"/>
         </w:rPr>
-        <w:t>R_{final} = R_{round1} \cup R_{privacy} \cup R_{anchor}</w:t>
+        <w:t>R_final = R_round1 ∪ R_privacy ∪ R_anchor</w:t>
       </w:r>
     </w:p>
     <w:p>
@@ -1939,7 +2011,7 @@
           <w:b w:val="0"/>
           <w:sz w:val="24"/>
         </w:rPr>
-        <w:t>其中，$R_{round1}$ 表示第一轮隐私拒答请求，$R_{privacy}$ 表示由残余泄露样本构造的二轮隐私修复请求，$R_{anchor}$ 表示与目标主体相关的公开知识锚点请求。公开锚点的作用不是让模型学习新的公开事实，而是在闭环再编辑过程中保留“该主体仍存在可回答的非敏感问题”这一约束信号。</w:t>
+        <w:t>其中，R_round1 表示第一轮直接隐私编辑请求，R_privacy 表示由残余泄露样本构造的隐私再编辑请求，R_anchor 表示用于保持公开知识的锚点请求。公开锚点可来自同主体公开知识，例如职业、学校、雇主或家乡，也可来自同关系其他主体公开知识，用于提醒模型同一关系并不总是隐私敏感。公开锚点的作用不是让模型学习新的公开事实，而是在闭环再编辑过程中保留“该主体仍存在可回答的非敏感问题”这一约束信号。</w:t>
       </w:r>
     </w:p>
     <w:p>
@@ -1953,7 +2025,77 @@
           <w:b w:val="0"/>
           <w:sz w:val="24"/>
         </w:rPr>
+        <w:t>CAPE-Anchor 与 PACE 的区别在于，PACE 只根据 residual leakage 构造二轮隐私请求，优化方向主要指向“继续压制泄露”。CAPE-Anchor 则把公开知识保留信号显式加入请求集合，使二轮编辑同时面对隐私压制和公开保持两个目标。CAPE-Anchor 与 CAPE 的区别在于，CAPE 主要通过候选筛选、主体预算和局部性风险控制来减少副作用；CAPE-Anchor 进一步把 public anchor 作为正向约束加入编辑请求集合，而不是只在选择阶段过滤风险样本。</w:t>
+      </w:r>
+    </w:p>
+    <w:p>
+      <w:pPr>
+        <w:spacing w:line="360" w:lineRule="auto" w:before="0" w:after="0"/>
+        <w:ind w:firstLine="480"/>
+      </w:pPr>
+      <w:r>
+        <w:rPr>
+          <w:rFonts w:ascii="Times New Roman" w:hAnsi="Times New Roman" w:eastAsia="宋体"/>
+          <w:b w:val="0"/>
+          <w:sz w:val="24"/>
+        </w:rPr>
+        <w:t>从方法边界看，CAPE-Anchor 仍然属于 wrapper-level request construction。它依赖 ROME 等基础编辑器执行参数更新，本身不改变 ROME/MEMIT/FT 的底层优化公式。因此，CAPE-Anchor 的贡献不应被表述为新的通用编辑器，而应表述为面向隐私清洗任务的请求层约束策略。该策略也不能保证在所有模型和所有提示上同时获得最低泄露与最高公开保持；它提供的是一种可解释的折中机制，使闭环再编辑不再只沿着“发现泄露—继续拒答”的单一方向扩张。</w:t>
+      </w:r>
+    </w:p>
+    <w:p>
+      <w:pPr>
+        <w:spacing w:line="360" w:lineRule="auto" w:before="0" w:after="0"/>
+        <w:ind w:firstLine="480"/>
+      </w:pPr>
+      <w:r>
+        <w:rPr>
+          <w:rFonts w:ascii="Times New Roman" w:hAnsi="Times New Roman" w:eastAsia="宋体"/>
+          <w:b w:val="0"/>
+          <w:sz w:val="24"/>
+        </w:rPr>
         <w:t>本文只采用有限配置检验 CAPE-Anchor 的作用，而不进行大规模参数搜索。K0 可视为不加入公开锚点的受限闭环对照，K1 和 K2 分别加入不同数量的公开锚点。正文分析关注这些配置在隐私值包含率和公开知识保持率之间形成的操作点，而不是把具体工程参数作为方法贡献。</w:t>
+      </w:r>
+    </w:p>
+    <w:p>
+      <w:pPr>
+        <w:pStyle w:val="Heading2"/>
+        <w:spacing w:before="200" w:after="120"/>
+      </w:pPr>
+      <w:r>
+        <w:rPr>
+          <w:rFonts w:ascii="Times New Roman" w:hAnsi="Times New Roman" w:eastAsia="黑体"/>
+          <w:b/>
+          <w:sz w:val="28"/>
+        </w:rPr>
+        <w:t>3.8  方法边界与复杂度分析</w:t>
+      </w:r>
+    </w:p>
+    <w:p>
+      <w:pPr>
+        <w:spacing w:line="360" w:lineRule="auto" w:before="0" w:after="0"/>
+        <w:ind w:firstLine="480"/>
+      </w:pPr>
+      <w:r>
+        <w:rPr>
+          <w:rFonts w:ascii="Times New Roman" w:hAnsi="Times New Roman" w:eastAsia="宋体"/>
+          <w:b w:val="0"/>
+          <w:sz w:val="24"/>
+        </w:rPr>
+        <w:t>PACE、CAPE 与 CAPE-Anchor 的额外成本主要来自二轮评估和请求构造。与单轮 ROME/MEMIT 相比，闭环方法需要先对编辑后模型进行一次残余泄露检测，再根据失败样本构造补充请求；CAPE-Anchor 还需要从公开事实集合中抽取锚点请求。因此，其计算成本不只取决于基础编辑器，也取决于评估 prompt 数量、残余泄露规模和公开锚点数量。</w:t>
+      </w:r>
+    </w:p>
+    <w:p>
+      <w:pPr>
+        <w:spacing w:line="360" w:lineRule="auto" w:before="0" w:after="0"/>
+        <w:ind w:firstLine="480"/>
+      </w:pPr>
+      <w:r>
+        <w:rPr>
+          <w:rFonts w:ascii="Times New Roman" w:hAnsi="Times New Roman" w:eastAsia="宋体"/>
+          <w:b w:val="0"/>
+          <w:sz w:val="24"/>
+        </w:rPr>
+        <w:t>该复杂度是本文方法的一个现实边界。对于小规模隐私清洗任务，闭环请求构造可以提供更细粒度的副作用诊断；对于大规模部署场景，则需要进一步研究采样策略、风险排序和模型特定校准。本文将 CAPE-Anchor 作为请求层机制分析，而不是声称它已经构成面向所有模型的稳定生产级清洗算法。</w:t>
       </w:r>
     </w:p>
     <w:p>
@@ -2524,15 +2666,15 @@
     <w:p>
       <w:pPr>
         <w:spacing w:line="360" w:lineRule="auto" w:before="0" w:after="0"/>
-        <w:jc w:val="center"/>
-      </w:pPr>
-      <w:r>
-        <w:rPr>
-          <w:rFonts w:ascii="Times New Roman" w:hAnsi="Times New Roman" w:eastAsia="宋体"/>
-          <w:b w:val="0"/>
-          <w:sz w:val="21"/>
-        </w:rPr>
-        <w:t>表 3 汇总 synthetic privacy 主实验结果。合并后泄露模型的隐私值包含率为 0.9387，公开知识保持率为 0.9766，说明该模型适合作为统一编辑起点。提示拒答的隐私值包含率仍为 0.9490，表明仅在提示层要求模型拒答并不能改变参数中已经形成的隐私事实关联。</w:t>
+        <w:ind w:firstLine="480"/>
+      </w:pPr>
+      <w:r>
+        <w:rPr>
+          <w:rFonts w:ascii="Times New Roman" w:hAnsi="Times New Roman" w:eastAsia="宋体"/>
+          <w:b w:val="0"/>
+          <w:sz w:val="24"/>
+        </w:rPr>
+        <w:t>本节实验目的在于回答两个问题：第一，合成隐私泄露模型是否构成有效测试对象；第二，通用模型编辑方法直接迁移到隐私拒答任务时会呈现怎样的隐私—效用端点。表 3 汇总 synthetic privacy 主实验结果。合并后泄露模型的隐私值包含率为 0.9387，公开知识保持率为 0.9766，说明该模型既记住目标隐私事实，也保留公开事实，因此适合作为统一编辑起点。提示拒答的隐私值包含率仍为 0.9490，表明仅在提示层要求模型拒答并不能改变参数中已经形成的隐私事实关联。</w:t>
       </w:r>
     </w:p>
     <w:p>
@@ -3378,91 +3520,91 @@
                 <w:b w:val="0"/>
                 <w:sz w:val="17"/>
               </w:rPr>
-              <w:t>failed</w:t>
-            </w:r>
-          </w:p>
-        </w:tc>
-        <w:tc>
-          <w:tcPr>
-            <w:tcW w:type="dxa" w:w="1455"/>
-            <w:vAlign w:val="center"/>
-          </w:tcPr>
-          <w:p>
-            <w:pPr>
-              <w:spacing w:line="276" w:lineRule="auto"/>
-              <w:jc w:val="left"/>
-            </w:pPr>
-            <w:r/>
-            <w:r>
-              <w:rPr>
-                <w:rFonts w:ascii="Times New Roman" w:hAnsi="Times New Roman" w:eastAsia="宋体"/>
-                <w:b w:val="0"/>
-                <w:sz w:val="17"/>
-              </w:rPr>
-              <w:t>failed: OOM on 48GB GPU</w:t>
-            </w:r>
-          </w:p>
-        </w:tc>
-        <w:tc>
-          <w:tcPr>
-            <w:tcW w:type="dxa" w:w="1455"/>
-            <w:vAlign w:val="center"/>
-          </w:tcPr>
-          <w:p>
-            <w:pPr>
-              <w:spacing w:line="276" w:lineRule="auto"/>
-              <w:jc w:val="center"/>
-            </w:pPr>
-            <w:r/>
-            <w:r>
-              <w:rPr>
-                <w:rFonts w:ascii="Times New Roman" w:hAnsi="Times New Roman" w:eastAsia="宋体"/>
-                <w:b w:val="0"/>
-                <w:sz w:val="17"/>
-              </w:rPr>
-              <w:t>failed</w:t>
-            </w:r>
-          </w:p>
-        </w:tc>
-        <w:tc>
-          <w:tcPr>
-            <w:tcW w:type="dxa" w:w="1455"/>
-            <w:vAlign w:val="center"/>
-          </w:tcPr>
-          <w:p>
-            <w:pPr>
-              <w:spacing w:line="276" w:lineRule="auto"/>
-              <w:jc w:val="center"/>
-            </w:pPr>
-            <w:r/>
-            <w:r>
-              <w:rPr>
-                <w:rFonts w:ascii="Times New Roman" w:hAnsi="Times New Roman" w:eastAsia="宋体"/>
-                <w:b w:val="0"/>
-                <w:sz w:val="17"/>
-              </w:rPr>
-              <w:t>failed</w:t>
-            </w:r>
-          </w:p>
-        </w:tc>
-        <w:tc>
-          <w:tcPr>
-            <w:tcW w:type="dxa" w:w="1455"/>
-            <w:vAlign w:val="center"/>
-          </w:tcPr>
-          <w:p>
-            <w:pPr>
-              <w:spacing w:line="276" w:lineRule="auto"/>
-              <w:jc w:val="center"/>
-            </w:pPr>
-            <w:r/>
-            <w:r>
-              <w:rPr>
-                <w:rFonts w:ascii="Times New Roman" w:hAnsi="Times New Roman" w:eastAsia="宋体"/>
-                <w:b w:val="0"/>
-                <w:sz w:val="17"/>
-              </w:rPr>
-              <w:t>failed</w:t>
+              <w:t>资源受限</w:t>
+            </w:r>
+          </w:p>
+        </w:tc>
+        <w:tc>
+          <w:tcPr>
+            <w:tcW w:type="dxa" w:w="1455"/>
+            <w:vAlign w:val="center"/>
+          </w:tcPr>
+          <w:p>
+            <w:pPr>
+              <w:spacing w:line="276" w:lineRule="auto"/>
+              <w:jc w:val="center"/>
+            </w:pPr>
+            <w:r/>
+            <w:r>
+              <w:rPr>
+                <w:rFonts w:ascii="Times New Roman" w:hAnsi="Times New Roman" w:eastAsia="宋体"/>
+                <w:b w:val="0"/>
+                <w:sz w:val="17"/>
+              </w:rPr>
+              <w:t>OOM</w:t>
+            </w:r>
+          </w:p>
+        </w:tc>
+        <w:tc>
+          <w:tcPr>
+            <w:tcW w:type="dxa" w:w="1455"/>
+            <w:vAlign w:val="center"/>
+          </w:tcPr>
+          <w:p>
+            <w:pPr>
+              <w:spacing w:line="276" w:lineRule="auto"/>
+              <w:jc w:val="center"/>
+            </w:pPr>
+            <w:r/>
+            <w:r>
+              <w:rPr>
+                <w:rFonts w:ascii="Times New Roman" w:hAnsi="Times New Roman" w:eastAsia="宋体"/>
+                <w:b w:val="0"/>
+                <w:sz w:val="17"/>
+              </w:rPr>
+              <w:t>-</w:t>
+            </w:r>
+          </w:p>
+        </w:tc>
+        <w:tc>
+          <w:tcPr>
+            <w:tcW w:type="dxa" w:w="1455"/>
+            <w:vAlign w:val="center"/>
+          </w:tcPr>
+          <w:p>
+            <w:pPr>
+              <w:spacing w:line="276" w:lineRule="auto"/>
+              <w:jc w:val="center"/>
+            </w:pPr>
+            <w:r/>
+            <w:r>
+              <w:rPr>
+                <w:rFonts w:ascii="Times New Roman" w:hAnsi="Times New Roman" w:eastAsia="宋体"/>
+                <w:b w:val="0"/>
+                <w:sz w:val="17"/>
+              </w:rPr>
+              <w:t>-</w:t>
+            </w:r>
+          </w:p>
+        </w:tc>
+        <w:tc>
+          <w:tcPr>
+            <w:tcW w:type="dxa" w:w="1455"/>
+            <w:vAlign w:val="center"/>
+          </w:tcPr>
+          <w:p>
+            <w:pPr>
+              <w:spacing w:line="276" w:lineRule="auto"/>
+              <w:jc w:val="center"/>
+            </w:pPr>
+            <w:r/>
+            <w:r>
+              <w:rPr>
+                <w:rFonts w:ascii="Times New Roman" w:hAnsi="Times New Roman" w:eastAsia="宋体"/>
+                <w:b w:val="0"/>
+                <w:sz w:val="17"/>
+              </w:rPr>
+              <w:t>-</w:t>
             </w:r>
           </w:p>
         </w:tc>
@@ -3506,91 +3648,91 @@
                 <w:b w:val="0"/>
                 <w:sz w:val="17"/>
               </w:rPr>
-              <w:t>failed</w:t>
-            </w:r>
-          </w:p>
-        </w:tc>
-        <w:tc>
-          <w:tcPr>
-            <w:tcW w:type="dxa" w:w="1455"/>
-            <w:vAlign w:val="center"/>
-          </w:tcPr>
-          <w:p>
-            <w:pPr>
-              <w:spacing w:line="276" w:lineRule="auto"/>
-              <w:jc w:val="left"/>
-            </w:pPr>
-            <w:r/>
-            <w:r>
-              <w:rPr>
-                <w:rFonts w:ascii="Times New Roman" w:hAnsi="Times New Roman" w:eastAsia="宋体"/>
-                <w:b w:val="0"/>
-                <w:sz w:val="17"/>
-              </w:rPr>
-              <w:t>failed: missing SentenceTransformer dependency</w:t>
-            </w:r>
-          </w:p>
-        </w:tc>
-        <w:tc>
-          <w:tcPr>
-            <w:tcW w:type="dxa" w:w="1455"/>
-            <w:vAlign w:val="center"/>
-          </w:tcPr>
-          <w:p>
-            <w:pPr>
-              <w:spacing w:line="276" w:lineRule="auto"/>
-              <w:jc w:val="center"/>
-            </w:pPr>
-            <w:r/>
-            <w:r>
-              <w:rPr>
-                <w:rFonts w:ascii="Times New Roman" w:hAnsi="Times New Roman" w:eastAsia="宋体"/>
-                <w:b w:val="0"/>
-                <w:sz w:val="17"/>
-              </w:rPr>
-              <w:t>failed</w:t>
-            </w:r>
-          </w:p>
-        </w:tc>
-        <w:tc>
-          <w:tcPr>
-            <w:tcW w:type="dxa" w:w="1455"/>
-            <w:vAlign w:val="center"/>
-          </w:tcPr>
-          <w:p>
-            <w:pPr>
-              <w:spacing w:line="276" w:lineRule="auto"/>
-              <w:jc w:val="center"/>
-            </w:pPr>
-            <w:r/>
-            <w:r>
-              <w:rPr>
-                <w:rFonts w:ascii="Times New Roman" w:hAnsi="Times New Roman" w:eastAsia="宋体"/>
-                <w:b w:val="0"/>
-                <w:sz w:val="17"/>
-              </w:rPr>
-              <w:t>failed</w:t>
-            </w:r>
-          </w:p>
-        </w:tc>
-        <w:tc>
-          <w:tcPr>
-            <w:tcW w:type="dxa" w:w="1455"/>
-            <w:vAlign w:val="center"/>
-          </w:tcPr>
-          <w:p>
-            <w:pPr>
-              <w:spacing w:line="276" w:lineRule="auto"/>
-              <w:jc w:val="center"/>
-            </w:pPr>
-            <w:r/>
-            <w:r>
-              <w:rPr>
-                <w:rFonts w:ascii="Times New Roman" w:hAnsi="Times New Roman" w:eastAsia="宋体"/>
-                <w:b w:val="0"/>
-                <w:sz w:val="17"/>
-              </w:rPr>
-              <w:t>failed</w:t>
+              <w:t>依赖缺失</w:t>
+            </w:r>
+          </w:p>
+        </w:tc>
+        <w:tc>
+          <w:tcPr>
+            <w:tcW w:type="dxa" w:w="1455"/>
+            <w:vAlign w:val="center"/>
+          </w:tcPr>
+          <w:p>
+            <w:pPr>
+              <w:spacing w:line="276" w:lineRule="auto"/>
+              <w:jc w:val="center"/>
+            </w:pPr>
+            <w:r/>
+            <w:r>
+              <w:rPr>
+                <w:rFonts w:ascii="Times New Roman" w:hAnsi="Times New Roman" w:eastAsia="宋体"/>
+                <w:b w:val="0"/>
+                <w:sz w:val="17"/>
+              </w:rPr>
+              <w:t>句向量模型缺失</w:t>
+            </w:r>
+          </w:p>
+        </w:tc>
+        <w:tc>
+          <w:tcPr>
+            <w:tcW w:type="dxa" w:w="1455"/>
+            <w:vAlign w:val="center"/>
+          </w:tcPr>
+          <w:p>
+            <w:pPr>
+              <w:spacing w:line="276" w:lineRule="auto"/>
+              <w:jc w:val="center"/>
+            </w:pPr>
+            <w:r/>
+            <w:r>
+              <w:rPr>
+                <w:rFonts w:ascii="Times New Roman" w:hAnsi="Times New Roman" w:eastAsia="宋体"/>
+                <w:b w:val="0"/>
+                <w:sz w:val="17"/>
+              </w:rPr>
+              <w:t>-</w:t>
+            </w:r>
+          </w:p>
+        </w:tc>
+        <w:tc>
+          <w:tcPr>
+            <w:tcW w:type="dxa" w:w="1455"/>
+            <w:vAlign w:val="center"/>
+          </w:tcPr>
+          <w:p>
+            <w:pPr>
+              <w:spacing w:line="276" w:lineRule="auto"/>
+              <w:jc w:val="center"/>
+            </w:pPr>
+            <w:r/>
+            <w:r>
+              <w:rPr>
+                <w:rFonts w:ascii="Times New Roman" w:hAnsi="Times New Roman" w:eastAsia="宋体"/>
+                <w:b w:val="0"/>
+                <w:sz w:val="17"/>
+              </w:rPr>
+              <w:t>-</w:t>
+            </w:r>
+          </w:p>
+        </w:tc>
+        <w:tc>
+          <w:tcPr>
+            <w:tcW w:type="dxa" w:w="1455"/>
+            <w:vAlign w:val="center"/>
+          </w:tcPr>
+          <w:p>
+            <w:pPr>
+              <w:spacing w:line="276" w:lineRule="auto"/>
+              <w:jc w:val="center"/>
+            </w:pPr>
+            <w:r/>
+            <w:r>
+              <w:rPr>
+                <w:rFonts w:ascii="Times New Roman" w:hAnsi="Times New Roman" w:eastAsia="宋体"/>
+                <w:b w:val="0"/>
+                <w:sz w:val="17"/>
+              </w:rPr>
+              <w:t>-</w:t>
             </w:r>
           </w:p>
         </w:tc>
@@ -4248,7 +4390,7 @@
           <w:b w:val="0"/>
           <w:sz w:val="24"/>
         </w:rPr>
-        <w:t>从基础编辑方法看，MEMIT 的公开知识保持率为 0.8472，但隐私值包含率仍为 0.8140，说明它在当前拒答式隐私清洗任务中更接近高保持、弱压制端点。ROME 将隐私值包含率降至 0.5787，同时公开知识保持率下降到 0.5591，形成中间权衡区域。FT 将隐私泄露相关指标压到 0，但公开知识保持率仅为 0.0040，说明强覆盖式微调可能通过破坏公开回答能力来获得低泄露数值。</w:t>
+        <w:t>结果观察显示，基础编辑器之间并不存在单一意义上的最优方法。MEMIT 的公开知识保持率为 0.8472，但隐私值包含率仍为 0.8140，说明它在当前拒答式隐私清洗任务中更接近高保持、弱压制端点。ROME 将隐私值包含率降至 0.5787，同时公开知识保持率下降到 0.5591，形成中间权衡区域。FT 将隐私泄露相关指标压到 0，但公开知识保持率仅为 0.0040，说明强覆盖式微调可能通过破坏公开回答能力来获得低泄露数值。</w:t>
       </w:r>
     </w:p>
     <w:p>
@@ -4262,7 +4404,7 @@
           <w:b w:val="0"/>
           <w:sz w:val="24"/>
         </w:rPr>
-        <w:t>PACE 和 CAPE 能进一步压低目标隐私值输出，隐私值包含率分别为 0.0243 和 0.0443；但二者公开知识保持率分别只有 0.0984 和 0.1119。这一结果揭示了闭环再编辑的核心副作用：残余泄露驱动的补充编辑能够扩大隐私压制覆盖面，却可能把拒答目标扩散到公开知识集合。</w:t>
+        <w:t>原因分析上，隐私拒答目标不同于普通事实替换。普通事实编辑只需把一个对象替换为另一个对象，而隐私清洗要求模型在同一主体上区分敏感事实和公开事实。PACE 和 CAPE 能进一步压低目标隐私值输出，隐私值包含率分别为 0.0243 和 0.0443；但二者公开知识保持率分别只有 0.0984 和 0.1119。这一结果揭示了闭环再编辑的核心副作用：残余泄露驱动的补充编辑能够扩大隐私压制覆盖面，却可能把拒答目标扩散到公开知识集合。该观察直接引出 CAPE-Anchor 的设计动机。</w:t>
       </w:r>
     </w:p>
     <w:p>
@@ -4290,9 +4432,594 @@
           <w:b w:val="0"/>
           <w:sz w:val="24"/>
         </w:rPr>
-        <w:t>PACE 的设计目标是用残余泄露样本补足单轮编辑覆盖不足。该策略在隐私压制上有效，但 public retain 结果表明，若二轮请求只由失败样本驱动，模型可能学习到更宽泛的人物相关拒答模式。CAPE 通过主体预算和局部性风险控制尝试缓解这一问题，但在当前结果中仍未避免 public collapse。</w:t>
-      </w:r>
-    </w:p>
+        <w:t>本节实验目的在于区分“隐私问题拒答”与“公开问题误拒答”。PACE 的设计目标是用残余泄露样本补足单轮编辑覆盖不足。该策略在隐私压制上有效，但 public retain 结果表明，若二轮请求只由失败样本驱动，模型可能学习到更宽泛的人物相关拒答模式。CAPE 通过主体预算和局部性风险控制尝试缓解这一问题，但在当前结果中仍未避免 public collapse。</w:t>
+      </w:r>
+    </w:p>
+    <w:p>
+      <w:pPr>
+        <w:spacing w:line="360" w:lineRule="auto" w:before="0" w:after="0"/>
+        <w:jc w:val="center"/>
+      </w:pPr>
+      <w:r>
+        <w:rPr>
+          <w:rFonts w:ascii="Times New Roman" w:hAnsi="Times New Roman" w:eastAsia="宋体"/>
+          <w:b w:val="0"/>
+          <w:sz w:val="21"/>
+        </w:rPr>
+        <w:t>表 4 给出公开问题拒答率。指标方向是越低越好，因为公开问题本应被回答，而不是被隐私拒答模板覆盖。PACE-target 与 PACE 的公开拒答率分别接近 0.97 和 0.81，同主体公开拒答率也处于高位，说明强隐私压制并不自动等价于高质量清洗。</w:t>
+      </w:r>
+    </w:p>
+    <w:p>
+      <w:pPr>
+        <w:spacing w:line="360" w:lineRule="auto" w:before="0" w:after="0"/>
+        <w:jc w:val="center"/>
+      </w:pPr>
+      <w:r>
+        <w:rPr>
+          <w:rFonts w:ascii="Times New Roman" w:hAnsi="Times New Roman" w:eastAsia="宋体"/>
+          <w:b w:val="0"/>
+          <w:sz w:val="21"/>
+        </w:rPr>
+        <w:t>表 4  公开问题拒答与过度拒答分析（↓越低越好，↑越高越好）</w:t>
+      </w:r>
+    </w:p>
+    <w:tbl>
+      <w:tblPr>
+        <w:tblStyle w:val="TableGrid"/>
+        <w:tblW w:type="auto" w:w="0"/>
+        <w:jc w:val="center"/>
+        <w:tblLayout w:type="autofit"/>
+        <w:tblLook w:firstColumn="1" w:firstRow="1" w:lastColumn="0" w:lastRow="0" w:noHBand="0" w:noVBand="1" w:val="04A0"/>
+      </w:tblPr>
+      <w:tblGrid>
+        <w:gridCol w:w="1746"/>
+        <w:gridCol w:w="1746"/>
+        <w:gridCol w:w="1746"/>
+        <w:gridCol w:w="1746"/>
+        <w:gridCol w:w="1746"/>
+      </w:tblGrid>
+      <w:tr>
+        <w:tc>
+          <w:tcPr>
+            <w:tcW w:type="dxa" w:w="1746"/>
+            <w:vAlign w:val="center"/>
+            <w:shd w:fill="E8EEF5"/>
+          </w:tcPr>
+          <w:p>
+            <w:pPr>
+              <w:spacing w:line="276" w:lineRule="auto"/>
+              <w:jc w:val="center"/>
+            </w:pPr>
+            <w:r/>
+            <w:r>
+              <w:rPr>
+                <w:rFonts w:ascii="Times New Roman" w:hAnsi="Times New Roman" w:eastAsia="宋体"/>
+                <w:b/>
+                <w:sz w:val="17"/>
+              </w:rPr>
+              <w:t>方法</w:t>
+            </w:r>
+          </w:p>
+        </w:tc>
+        <w:tc>
+          <w:tcPr>
+            <w:tcW w:type="dxa" w:w="1746"/>
+            <w:vAlign w:val="center"/>
+            <w:shd w:fill="E8EEF5"/>
+          </w:tcPr>
+          <w:p>
+            <w:pPr>
+              <w:spacing w:line="276" w:lineRule="auto"/>
+              <w:jc w:val="center"/>
+            </w:pPr>
+            <w:r/>
+            <w:r>
+              <w:rPr>
+                <w:rFonts w:ascii="Times New Roman" w:hAnsi="Times New Roman" w:eastAsia="宋体"/>
+                <w:b/>
+                <w:sz w:val="17"/>
+              </w:rPr>
+              <w:t>公开拒答率↓</w:t>
+            </w:r>
+          </w:p>
+        </w:tc>
+        <w:tc>
+          <w:tcPr>
+            <w:tcW w:type="dxa" w:w="1746"/>
+            <w:vAlign w:val="center"/>
+            <w:shd w:fill="E8EEF5"/>
+          </w:tcPr>
+          <w:p>
+            <w:pPr>
+              <w:spacing w:line="276" w:lineRule="auto"/>
+              <w:jc w:val="center"/>
+            </w:pPr>
+            <w:r/>
+            <w:r>
+              <w:rPr>
+                <w:rFonts w:ascii="Times New Roman" w:hAnsi="Times New Roman" w:eastAsia="宋体"/>
+                <w:b/>
+                <w:sz w:val="17"/>
+              </w:rPr>
+              <w:t>同主体公开拒答率↓</w:t>
+            </w:r>
+          </w:p>
+        </w:tc>
+        <w:tc>
+          <w:tcPr>
+            <w:tcW w:type="dxa" w:w="1746"/>
+            <w:vAlign w:val="center"/>
+            <w:shd w:fill="E8EEF5"/>
+          </w:tcPr>
+          <w:p>
+            <w:pPr>
+              <w:spacing w:line="276" w:lineRule="auto"/>
+              <w:jc w:val="center"/>
+            </w:pPr>
+            <w:r/>
+            <w:r>
+              <w:rPr>
+                <w:rFonts w:ascii="Times New Roman" w:hAnsi="Times New Roman" w:eastAsia="宋体"/>
+                <w:b/>
+                <w:sz w:val="17"/>
+              </w:rPr>
+              <w:t>同关系其他主体拒答率↓</w:t>
+            </w:r>
+          </w:p>
+        </w:tc>
+        <w:tc>
+          <w:tcPr>
+            <w:tcW w:type="dxa" w:w="1746"/>
+            <w:vAlign w:val="center"/>
+            <w:shd w:fill="E8EEF5"/>
+          </w:tcPr>
+          <w:p>
+            <w:pPr>
+              <w:spacing w:line="276" w:lineRule="auto"/>
+              <w:jc w:val="center"/>
+            </w:pPr>
+            <w:r/>
+            <w:r>
+              <w:rPr>
+                <w:rFonts w:ascii="Times New Roman" w:hAnsi="Times New Roman" w:eastAsia="宋体"/>
+                <w:b/>
+                <w:sz w:val="17"/>
+              </w:rPr>
+              <w:t>公开知识保持率↑</w:t>
+            </w:r>
+          </w:p>
+        </w:tc>
+      </w:tr>
+      <w:tr>
+        <w:tc>
+          <w:tcPr>
+            <w:tcW w:type="dxa" w:w="1746"/>
+            <w:vAlign w:val="center"/>
+          </w:tcPr>
+          <w:p>
+            <w:pPr>
+              <w:spacing w:line="276" w:lineRule="auto"/>
+              <w:jc w:val="center"/>
+            </w:pPr>
+            <w:r/>
+            <w:r>
+              <w:rPr>
+                <w:rFonts w:ascii="Times New Roman" w:hAnsi="Times New Roman" w:eastAsia="宋体"/>
+                <w:b w:val="0"/>
+                <w:sz w:val="17"/>
+              </w:rPr>
+              <w:t>ROME</w:t>
+            </w:r>
+          </w:p>
+        </w:tc>
+        <w:tc>
+          <w:tcPr>
+            <w:tcW w:type="dxa" w:w="1746"/>
+            <w:vAlign w:val="center"/>
+          </w:tcPr>
+          <w:p>
+            <w:pPr>
+              <w:spacing w:line="276" w:lineRule="auto"/>
+              <w:jc w:val="center"/>
+            </w:pPr>
+            <w:r/>
+            <w:r>
+              <w:rPr>
+                <w:rFonts w:ascii="Times New Roman" w:hAnsi="Times New Roman" w:eastAsia="宋体"/>
+                <w:b w:val="0"/>
+                <w:sz w:val="17"/>
+              </w:rPr>
+              <w:t>0.4679</w:t>
+            </w:r>
+          </w:p>
+        </w:tc>
+        <w:tc>
+          <w:tcPr>
+            <w:tcW w:type="dxa" w:w="1746"/>
+            <w:vAlign w:val="center"/>
+          </w:tcPr>
+          <w:p>
+            <w:pPr>
+              <w:spacing w:line="276" w:lineRule="auto"/>
+              <w:jc w:val="center"/>
+            </w:pPr>
+            <w:r/>
+            <w:r>
+              <w:rPr>
+                <w:rFonts w:ascii="Times New Roman" w:hAnsi="Times New Roman" w:eastAsia="宋体"/>
+                <w:b w:val="0"/>
+                <w:sz w:val="17"/>
+              </w:rPr>
+              <w:t>0.4075</w:t>
+            </w:r>
+          </w:p>
+        </w:tc>
+        <w:tc>
+          <w:tcPr>
+            <w:tcW w:type="dxa" w:w="1746"/>
+            <w:vAlign w:val="center"/>
+          </w:tcPr>
+          <w:p>
+            <w:pPr>
+              <w:spacing w:line="276" w:lineRule="auto"/>
+              <w:jc w:val="center"/>
+            </w:pPr>
+            <w:r/>
+            <w:r>
+              <w:rPr>
+                <w:rFonts w:ascii="Times New Roman" w:hAnsi="Times New Roman" w:eastAsia="宋体"/>
+                <w:b w:val="0"/>
+                <w:sz w:val="17"/>
+              </w:rPr>
+              <w:t>0.5742</w:t>
+            </w:r>
+          </w:p>
+        </w:tc>
+        <w:tc>
+          <w:tcPr>
+            <w:tcW w:type="dxa" w:w="1746"/>
+            <w:vAlign w:val="center"/>
+          </w:tcPr>
+          <w:p>
+            <w:pPr>
+              <w:spacing w:line="276" w:lineRule="auto"/>
+              <w:jc w:val="center"/>
+            </w:pPr>
+            <w:r/>
+            <w:r>
+              <w:rPr>
+                <w:rFonts w:ascii="Times New Roman" w:hAnsi="Times New Roman" w:eastAsia="宋体"/>
+                <w:b w:val="0"/>
+                <w:sz w:val="17"/>
+              </w:rPr>
+              <w:t>0.5591</w:t>
+            </w:r>
+          </w:p>
+        </w:tc>
+      </w:tr>
+      <w:tr>
+        <w:tc>
+          <w:tcPr>
+            <w:tcW w:type="dxa" w:w="1746"/>
+            <w:vAlign w:val="center"/>
+          </w:tcPr>
+          <w:p>
+            <w:pPr>
+              <w:spacing w:line="276" w:lineRule="auto"/>
+              <w:jc w:val="center"/>
+            </w:pPr>
+            <w:r/>
+            <w:r>
+              <w:rPr>
+                <w:rFonts w:ascii="Times New Roman" w:hAnsi="Times New Roman" w:eastAsia="宋体"/>
+                <w:b w:val="0"/>
+                <w:sz w:val="17"/>
+              </w:rPr>
+              <w:t>MEMIT</w:t>
+            </w:r>
+          </w:p>
+        </w:tc>
+        <w:tc>
+          <w:tcPr>
+            <w:tcW w:type="dxa" w:w="1746"/>
+            <w:vAlign w:val="center"/>
+          </w:tcPr>
+          <w:p>
+            <w:pPr>
+              <w:spacing w:line="276" w:lineRule="auto"/>
+              <w:jc w:val="center"/>
+            </w:pPr>
+            <w:r/>
+            <w:r>
+              <w:rPr>
+                <w:rFonts w:ascii="Times New Roman" w:hAnsi="Times New Roman" w:eastAsia="宋体"/>
+                <w:b w:val="0"/>
+                <w:sz w:val="17"/>
+              </w:rPr>
+              <w:t>0.1484</w:t>
+            </w:r>
+          </w:p>
+        </w:tc>
+        <w:tc>
+          <w:tcPr>
+            <w:tcW w:type="dxa" w:w="1746"/>
+            <w:vAlign w:val="center"/>
+          </w:tcPr>
+          <w:p>
+            <w:pPr>
+              <w:spacing w:line="276" w:lineRule="auto"/>
+              <w:jc w:val="center"/>
+            </w:pPr>
+            <w:r/>
+            <w:r>
+              <w:rPr>
+                <w:rFonts w:ascii="Times New Roman" w:hAnsi="Times New Roman" w:eastAsia="宋体"/>
+                <w:b w:val="0"/>
+                <w:sz w:val="17"/>
+              </w:rPr>
+              <w:t>0.1492</w:t>
+            </w:r>
+          </w:p>
+        </w:tc>
+        <w:tc>
+          <w:tcPr>
+            <w:tcW w:type="dxa" w:w="1746"/>
+            <w:vAlign w:val="center"/>
+          </w:tcPr>
+          <w:p>
+            <w:pPr>
+              <w:spacing w:line="276" w:lineRule="auto"/>
+              <w:jc w:val="center"/>
+            </w:pPr>
+            <w:r/>
+            <w:r>
+              <w:rPr>
+                <w:rFonts w:ascii="Times New Roman" w:hAnsi="Times New Roman" w:eastAsia="宋体"/>
+                <w:b w:val="0"/>
+                <w:sz w:val="17"/>
+              </w:rPr>
+              <w:t>0.1625</w:t>
+            </w:r>
+          </w:p>
+        </w:tc>
+        <w:tc>
+          <w:tcPr>
+            <w:tcW w:type="dxa" w:w="1746"/>
+            <w:vAlign w:val="center"/>
+          </w:tcPr>
+          <w:p>
+            <w:pPr>
+              <w:spacing w:line="276" w:lineRule="auto"/>
+              <w:jc w:val="center"/>
+            </w:pPr>
+            <w:r/>
+            <w:r>
+              <w:rPr>
+                <w:rFonts w:ascii="Times New Roman" w:hAnsi="Times New Roman" w:eastAsia="宋体"/>
+                <w:b w:val="0"/>
+                <w:sz w:val="17"/>
+              </w:rPr>
+              <w:t>0.8472</w:t>
+            </w:r>
+          </w:p>
+        </w:tc>
+      </w:tr>
+      <w:tr>
+        <w:tc>
+          <w:tcPr>
+            <w:tcW w:type="dxa" w:w="1746"/>
+            <w:vAlign w:val="center"/>
+          </w:tcPr>
+          <w:p>
+            <w:pPr>
+              <w:spacing w:line="276" w:lineRule="auto"/>
+              <w:jc w:val="center"/>
+            </w:pPr>
+            <w:r/>
+            <w:r>
+              <w:rPr>
+                <w:rFonts w:ascii="Times New Roman" w:hAnsi="Times New Roman" w:eastAsia="宋体"/>
+                <w:b w:val="0"/>
+                <w:sz w:val="17"/>
+              </w:rPr>
+              <w:t>PACE-target</w:t>
+            </w:r>
+          </w:p>
+        </w:tc>
+        <w:tc>
+          <w:tcPr>
+            <w:tcW w:type="dxa" w:w="1746"/>
+            <w:vAlign w:val="center"/>
+          </w:tcPr>
+          <w:p>
+            <w:pPr>
+              <w:spacing w:line="276" w:lineRule="auto"/>
+              <w:jc w:val="center"/>
+            </w:pPr>
+            <w:r/>
+            <w:r>
+              <w:rPr>
+                <w:rFonts w:ascii="Times New Roman" w:hAnsi="Times New Roman" w:eastAsia="宋体"/>
+                <w:b w:val="0"/>
+                <w:sz w:val="17"/>
+              </w:rPr>
+              <w:t>0.9675</w:t>
+            </w:r>
+          </w:p>
+        </w:tc>
+        <w:tc>
+          <w:tcPr>
+            <w:tcW w:type="dxa" w:w="1746"/>
+            <w:vAlign w:val="center"/>
+          </w:tcPr>
+          <w:p>
+            <w:pPr>
+              <w:spacing w:line="276" w:lineRule="auto"/>
+              <w:jc w:val="center"/>
+            </w:pPr>
+            <w:r/>
+            <w:r>
+              <w:rPr>
+                <w:rFonts w:ascii="Times New Roman" w:hAnsi="Times New Roman" w:eastAsia="宋体"/>
+                <w:b w:val="0"/>
+                <w:sz w:val="17"/>
+              </w:rPr>
+              <w:t>0.9958</w:t>
+            </w:r>
+          </w:p>
+        </w:tc>
+        <w:tc>
+          <w:tcPr>
+            <w:tcW w:type="dxa" w:w="1746"/>
+            <w:vAlign w:val="center"/>
+          </w:tcPr>
+          <w:p>
+            <w:pPr>
+              <w:spacing w:line="276" w:lineRule="auto"/>
+              <w:jc w:val="center"/>
+            </w:pPr>
+            <w:r/>
+            <w:r>
+              <w:rPr>
+                <w:rFonts w:ascii="Times New Roman" w:hAnsi="Times New Roman" w:eastAsia="宋体"/>
+                <w:b w:val="0"/>
+                <w:sz w:val="17"/>
+              </w:rPr>
+              <w:t>0.9942</w:t>
+            </w:r>
+          </w:p>
+        </w:tc>
+        <w:tc>
+          <w:tcPr>
+            <w:tcW w:type="dxa" w:w="1746"/>
+            <w:vAlign w:val="center"/>
+          </w:tcPr>
+          <w:p>
+            <w:pPr>
+              <w:spacing w:line="276" w:lineRule="auto"/>
+              <w:jc w:val="center"/>
+            </w:pPr>
+            <w:r/>
+            <w:r>
+              <w:rPr>
+                <w:rFonts w:ascii="Times New Roman" w:hAnsi="Times New Roman" w:eastAsia="宋体"/>
+                <w:b w:val="0"/>
+                <w:sz w:val="17"/>
+              </w:rPr>
+              <w:t>0.0032</w:t>
+            </w:r>
+          </w:p>
+        </w:tc>
+      </w:tr>
+      <w:tr>
+        <w:tc>
+          <w:tcPr>
+            <w:tcW w:type="dxa" w:w="1746"/>
+            <w:vAlign w:val="center"/>
+          </w:tcPr>
+          <w:p>
+            <w:pPr>
+              <w:spacing w:line="276" w:lineRule="auto"/>
+              <w:jc w:val="center"/>
+            </w:pPr>
+            <w:r/>
+            <w:r>
+              <w:rPr>
+                <w:rFonts w:ascii="Times New Roman" w:hAnsi="Times New Roman" w:eastAsia="宋体"/>
+                <w:b w:val="0"/>
+                <w:sz w:val="17"/>
+              </w:rPr>
+              <w:t>PACE</w:t>
+            </w:r>
+          </w:p>
+        </w:tc>
+        <w:tc>
+          <w:tcPr>
+            <w:tcW w:type="dxa" w:w="1746"/>
+            <w:vAlign w:val="center"/>
+          </w:tcPr>
+          <w:p>
+            <w:pPr>
+              <w:spacing w:line="276" w:lineRule="auto"/>
+              <w:jc w:val="center"/>
+            </w:pPr>
+            <w:r/>
+            <w:r>
+              <w:rPr>
+                <w:rFonts w:ascii="Times New Roman" w:hAnsi="Times New Roman" w:eastAsia="宋体"/>
+                <w:b w:val="0"/>
+                <w:sz w:val="17"/>
+              </w:rPr>
+              <w:t>0.8115</w:t>
+            </w:r>
+          </w:p>
+        </w:tc>
+        <w:tc>
+          <w:tcPr>
+            <w:tcW w:type="dxa" w:w="1746"/>
+            <w:vAlign w:val="center"/>
+          </w:tcPr>
+          <w:p>
+            <w:pPr>
+              <w:spacing w:line="276" w:lineRule="auto"/>
+              <w:jc w:val="center"/>
+            </w:pPr>
+            <w:r/>
+            <w:r>
+              <w:rPr>
+                <w:rFonts w:ascii="Times New Roman" w:hAnsi="Times New Roman" w:eastAsia="宋体"/>
+                <w:b w:val="0"/>
+                <w:sz w:val="17"/>
+              </w:rPr>
+              <w:t>0.7950</w:t>
+            </w:r>
+          </w:p>
+        </w:tc>
+        <w:tc>
+          <w:tcPr>
+            <w:tcW w:type="dxa" w:w="1746"/>
+            <w:vAlign w:val="center"/>
+          </w:tcPr>
+          <w:p>
+            <w:pPr>
+              <w:spacing w:line="276" w:lineRule="auto"/>
+              <w:jc w:val="center"/>
+            </w:pPr>
+            <w:r/>
+            <w:r>
+              <w:rPr>
+                <w:rFonts w:ascii="Times New Roman" w:hAnsi="Times New Roman" w:eastAsia="宋体"/>
+                <w:b w:val="0"/>
+                <w:sz w:val="17"/>
+              </w:rPr>
+              <w:t>0.8925</w:t>
+            </w:r>
+          </w:p>
+        </w:tc>
+        <w:tc>
+          <w:tcPr>
+            <w:tcW w:type="dxa" w:w="1746"/>
+            <w:vAlign w:val="center"/>
+          </w:tcPr>
+          <w:p>
+            <w:pPr>
+              <w:spacing w:line="276" w:lineRule="auto"/>
+              <w:jc w:val="center"/>
+            </w:pPr>
+            <w:r/>
+            <w:r>
+              <w:rPr>
+                <w:rFonts w:ascii="Times New Roman" w:hAnsi="Times New Roman" w:eastAsia="宋体"/>
+                <w:b w:val="0"/>
+                <w:sz w:val="17"/>
+              </w:rPr>
+              <w:t>0.0984</w:t>
+            </w:r>
+          </w:p>
+        </w:tc>
+      </w:tr>
+    </w:tbl>
+    <w:p/>
     <w:p>
       <w:pPr>
         <w:spacing w:line="360" w:lineRule="auto" w:before="0" w:after="0"/>
@@ -4304,7 +5031,7 @@
           <w:b w:val="0"/>
           <w:sz w:val="24"/>
         </w:rPr>
-        <w:t>这一现象说明，隐私清洗不能只报告 private refusal 或目标泄露下降。一个模型如果对隐私问题拒答，同时也对公开问题拒答，那么它更接近“泛化拒答”而不是高质量隐私清洗。本文引入 public refusal 和 public contains 的目的，正是将这种副作用从隐私压制数值中分离出来。</w:t>
+        <w:t>这一现象说明，隐私清洗不能只报告 private refusal 或目标泄露下降。一个模型如果对隐私问题拒答，同时也对公开问题拒答，那么它更接近“泛化拒答”而不是高质量隐私清洗。本文引入 public refusal 和 public contains 的目的，正是将这种副作用从隐私压制数值中分离出来。该表支持本文的方法动机：需要在残余泄露闭环之外加入公开知识约束。</w:t>
       </w:r>
     </w:p>
     <w:p>
@@ -4332,7 +5059,7 @@
           <w:b w:val="0"/>
           <w:sz w:val="24"/>
         </w:rPr>
-        <w:t>CAPE-Anchor 的目标不是继续追求最低隐私泄露率，而是在闭环再编辑中加入公开知识锚点，使模型在二轮编辑时同时接触隐私拒答请求和公开事实保留信号。表 4 展示了有限消融结果。</w:t>
+        <w:t>CAPE-Anchor 的目标不是继续追求最低隐私泄露率，而是在闭环再编辑中加入公开知识锚点，使模型在二轮编辑时同时接触隐私拒答请求和公开事实保留信号。表 5 展示了有限消融结果。</w:t>
       </w:r>
     </w:p>
     <w:p>
@@ -4346,7 +5073,7 @@
           <w:b w:val="0"/>
           <w:sz w:val="21"/>
         </w:rPr>
-        <w:t>表 4  CAPE-Anchor 消融结果</w:t>
+        <w:t>表 5  CAPE-Anchor 消融结果</w:t>
       </w:r>
     </w:p>
     <w:tbl>
@@ -4943,20 +5670,7 @@
     </w:p>
     <w:p>
       <w:pPr>
-        <w:spacing w:line="360" w:lineRule="auto" w:before="0" w:after="0"/>
-        <w:jc w:val="center"/>
-      </w:pPr>
-      <w:r>
-        <w:rPr>
-          <w:rFonts w:ascii="Times New Roman" w:hAnsi="Times New Roman" w:eastAsia="宋体"/>
-          <w:b w:val="0"/>
-          <w:sz w:val="21"/>
-        </w:rPr>
-        <w:t>图 3  合成隐私基准上的隐私压制—知识保持权衡散点图</w:t>
-      </w:r>
-    </w:p>
-    <w:p>
-      <w:pPr>
+        <w:keepNext/>
         <w:jc w:val="center"/>
       </w:pPr>
       <w:r>
@@ -5005,25 +5719,26 @@
           <w:b w:val="0"/>
           <w:sz w:val="21"/>
         </w:rPr>
+        <w:t>图 3  合成隐私基准上的隐私压制—知识保持权衡散点图</w:t>
+      </w:r>
+    </w:p>
+    <w:p>
+      <w:pPr>
+        <w:spacing w:line="360" w:lineRule="auto" w:before="0" w:after="0"/>
+        <w:jc w:val="center"/>
+      </w:pPr>
+      <w:r>
+        <w:rPr>
+          <w:rFonts w:ascii="Times New Roman" w:hAnsi="Times New Roman" w:eastAsia="宋体"/>
+          <w:b w:val="0"/>
+          <w:sz w:val="21"/>
+        </w:rPr>
         <w:t>图 3 的关键观察是：MEMIT 靠近高保持弱压制区域，FT、PACE 和 CAPE 靠近强压制低保持区域，ROME 处于中间位置，而 CAPE-Anchor K1/K2 将操作点向公开知识保持方向移动。该图支撑本文的核心结论：隐私清洗方法不能只按单一泄露率排序，而应在隐私压制和知识保持坐标系中解释。</w:t>
       </w:r>
     </w:p>
     <w:p>
       <w:pPr>
-        <w:spacing w:line="360" w:lineRule="auto" w:before="0" w:after="0"/>
-        <w:jc w:val="center"/>
-      </w:pPr>
-      <w:r>
-        <w:rPr>
-          <w:rFonts w:ascii="Times New Roman" w:hAnsi="Times New Roman" w:eastAsia="宋体"/>
-          <w:b w:val="0"/>
-          <w:sz w:val="21"/>
-        </w:rPr>
-        <w:t>图 4  CAPE-Anchor 消融折中图</w:t>
-      </w:r>
-    </w:p>
-    <w:p>
-      <w:pPr>
+        <w:keepNext/>
         <w:jc w:val="center"/>
       </w:pPr>
       <w:r>
@@ -5072,6 +5787,20 @@
           <w:b w:val="0"/>
           <w:sz w:val="21"/>
         </w:rPr>
+        <w:t>图 4  CAPE-Anchor 消融折中图</w:t>
+      </w:r>
+    </w:p>
+    <w:p>
+      <w:pPr>
+        <w:spacing w:line="360" w:lineRule="auto" w:before="0" w:after="0"/>
+        <w:jc w:val="center"/>
+      </w:pPr>
+      <w:r>
+        <w:rPr>
+          <w:rFonts w:ascii="Times New Roman" w:hAnsi="Times New Roman" w:eastAsia="宋体"/>
+          <w:b w:val="0"/>
+          <w:sz w:val="21"/>
+        </w:rPr>
         <w:t>图 4 进一步显示，随着公开锚点增加，公开知识保持率上升，但隐私值包含率也同步上升。这说明 public anchor 是一种约束信号，而不是免费收益；其价值在于提供可调节的操作点，使研究者可以根据应用场景选择更偏隐私压制或更偏公开知识保持的配置。</w:t>
       </w:r>
     </w:p>
@@ -5086,7 +5815,7 @@
           <w:b/>
           <w:sz w:val="28"/>
         </w:rPr>
-        <w:t>4.8  Qwen 公开事实编辑迁移验证</w:t>
+        <w:t>4.8  分攻击类型鲁棒性分析</w:t>
       </w:r>
     </w:p>
     <w:p>
@@ -5100,7 +5829,7 @@
           <w:b w:val="0"/>
           <w:sz w:val="24"/>
         </w:rPr>
-        <w:t>CounterFact 和 zsRE 是公开事实编辑数据集，不是隐私清洗数据集。本文使用它们的目的，是检查 PACE/CAPE 这种 closed-loop request selection 是否能在公开 factual editing 场景中运行，并观察其 reliability 与 generalization 表现。表 5 给出 Qwen 上的 public transfer 结果。</w:t>
+        <w:t>本节实验目的在于检查不同攻击提示是否具有不同清洗难度。表 6 将 direct、paraphrase、completion、roleplay 和 context 分开报告。指标为隐私值包含率，数值越低表示对应攻击类型下目标隐私值越少出现在输出中。</w:t>
       </w:r>
     </w:p>
     <w:p>
@@ -5114,7 +5843,599 @@
           <w:b w:val="0"/>
           <w:sz w:val="21"/>
         </w:rPr>
-        <w:t>表 5  Qwen 公开事实编辑迁移验证结果</w:t>
+        <w:t>表 6  分攻击类型隐私值包含率（↓越低越好）</w:t>
+      </w:r>
+    </w:p>
+    <w:tbl>
+      <w:tblPr>
+        <w:tblStyle w:val="TableGrid"/>
+        <w:tblW w:type="auto" w:w="0"/>
+        <w:jc w:val="center"/>
+        <w:tblLayout w:type="autofit"/>
+        <w:tblLook w:firstColumn="1" w:firstRow="1" w:lastColumn="0" w:lastRow="0" w:noHBand="0" w:noVBand="1" w:val="04A0"/>
+      </w:tblPr>
+      <w:tblGrid>
+        <w:gridCol w:w="1455"/>
+        <w:gridCol w:w="1455"/>
+        <w:gridCol w:w="1455"/>
+        <w:gridCol w:w="1455"/>
+        <w:gridCol w:w="1455"/>
+        <w:gridCol w:w="1455"/>
+      </w:tblGrid>
+      <w:tr>
+        <w:tc>
+          <w:tcPr>
+            <w:tcW w:type="dxa" w:w="1455"/>
+            <w:vAlign w:val="center"/>
+            <w:shd w:fill="E8EEF5"/>
+          </w:tcPr>
+          <w:p>
+            <w:pPr>
+              <w:spacing w:line="276" w:lineRule="auto"/>
+              <w:jc w:val="center"/>
+            </w:pPr>
+            <w:r/>
+            <w:r>
+              <w:rPr>
+                <w:rFonts w:ascii="Times New Roman" w:hAnsi="Times New Roman" w:eastAsia="宋体"/>
+                <w:b/>
+                <w:sz w:val="17"/>
+              </w:rPr>
+              <w:t>方法</w:t>
+            </w:r>
+          </w:p>
+        </w:tc>
+        <w:tc>
+          <w:tcPr>
+            <w:tcW w:type="dxa" w:w="1455"/>
+            <w:vAlign w:val="center"/>
+            <w:shd w:fill="E8EEF5"/>
+          </w:tcPr>
+          <w:p>
+            <w:pPr>
+              <w:spacing w:line="276" w:lineRule="auto"/>
+              <w:jc w:val="center"/>
+            </w:pPr>
+            <w:r/>
+            <w:r>
+              <w:rPr>
+                <w:rFonts w:ascii="Times New Roman" w:hAnsi="Times New Roman" w:eastAsia="宋体"/>
+                <w:b/>
+                <w:sz w:val="17"/>
+              </w:rPr>
+              <w:t>direct</w:t>
+            </w:r>
+          </w:p>
+        </w:tc>
+        <w:tc>
+          <w:tcPr>
+            <w:tcW w:type="dxa" w:w="1455"/>
+            <w:vAlign w:val="center"/>
+            <w:shd w:fill="E8EEF5"/>
+          </w:tcPr>
+          <w:p>
+            <w:pPr>
+              <w:spacing w:line="276" w:lineRule="auto"/>
+              <w:jc w:val="center"/>
+            </w:pPr>
+            <w:r/>
+            <w:r>
+              <w:rPr>
+                <w:rFonts w:ascii="Times New Roman" w:hAnsi="Times New Roman" w:eastAsia="宋体"/>
+                <w:b/>
+                <w:sz w:val="17"/>
+              </w:rPr>
+              <w:t>paraphrase</w:t>
+            </w:r>
+          </w:p>
+        </w:tc>
+        <w:tc>
+          <w:tcPr>
+            <w:tcW w:type="dxa" w:w="1455"/>
+            <w:vAlign w:val="center"/>
+            <w:shd w:fill="E8EEF5"/>
+          </w:tcPr>
+          <w:p>
+            <w:pPr>
+              <w:spacing w:line="276" w:lineRule="auto"/>
+              <w:jc w:val="center"/>
+            </w:pPr>
+            <w:r/>
+            <w:r>
+              <w:rPr>
+                <w:rFonts w:ascii="Times New Roman" w:hAnsi="Times New Roman" w:eastAsia="宋体"/>
+                <w:b/>
+                <w:sz w:val="17"/>
+              </w:rPr>
+              <w:t>completion</w:t>
+            </w:r>
+          </w:p>
+        </w:tc>
+        <w:tc>
+          <w:tcPr>
+            <w:tcW w:type="dxa" w:w="1455"/>
+            <w:vAlign w:val="center"/>
+            <w:shd w:fill="E8EEF5"/>
+          </w:tcPr>
+          <w:p>
+            <w:pPr>
+              <w:spacing w:line="276" w:lineRule="auto"/>
+              <w:jc w:val="center"/>
+            </w:pPr>
+            <w:r/>
+            <w:r>
+              <w:rPr>
+                <w:rFonts w:ascii="Times New Roman" w:hAnsi="Times New Roman" w:eastAsia="宋体"/>
+                <w:b/>
+                <w:sz w:val="17"/>
+              </w:rPr>
+              <w:t>roleplay</w:t>
+            </w:r>
+          </w:p>
+        </w:tc>
+        <w:tc>
+          <w:tcPr>
+            <w:tcW w:type="dxa" w:w="1455"/>
+            <w:vAlign w:val="center"/>
+            <w:shd w:fill="E8EEF5"/>
+          </w:tcPr>
+          <w:p>
+            <w:pPr>
+              <w:spacing w:line="276" w:lineRule="auto"/>
+              <w:jc w:val="center"/>
+            </w:pPr>
+            <w:r/>
+            <w:r>
+              <w:rPr>
+                <w:rFonts w:ascii="Times New Roman" w:hAnsi="Times New Roman" w:eastAsia="宋体"/>
+                <w:b/>
+                <w:sz w:val="17"/>
+              </w:rPr>
+              <w:t>context</w:t>
+            </w:r>
+          </w:p>
+        </w:tc>
+      </w:tr>
+      <w:tr>
+        <w:tc>
+          <w:tcPr>
+            <w:tcW w:type="dxa" w:w="1455"/>
+            <w:vAlign w:val="center"/>
+          </w:tcPr>
+          <w:p>
+            <w:pPr>
+              <w:spacing w:line="276" w:lineRule="auto"/>
+              <w:jc w:val="center"/>
+            </w:pPr>
+            <w:r/>
+            <w:r>
+              <w:rPr>
+                <w:rFonts w:ascii="Times New Roman" w:hAnsi="Times New Roman" w:eastAsia="宋体"/>
+                <w:b w:val="0"/>
+                <w:sz w:val="17"/>
+              </w:rPr>
+              <w:t>泄露模型</w:t>
+            </w:r>
+          </w:p>
+        </w:tc>
+        <w:tc>
+          <w:tcPr>
+            <w:tcW w:type="dxa" w:w="1455"/>
+            <w:vAlign w:val="center"/>
+          </w:tcPr>
+          <w:p>
+            <w:pPr>
+              <w:spacing w:line="276" w:lineRule="auto"/>
+              <w:jc w:val="center"/>
+            </w:pPr>
+            <w:r/>
+            <w:r>
+              <w:rPr>
+                <w:rFonts w:ascii="Times New Roman" w:hAnsi="Times New Roman" w:eastAsia="宋体"/>
+                <w:b w:val="0"/>
+                <w:sz w:val="17"/>
+              </w:rPr>
+              <w:t>0.9350</w:t>
+            </w:r>
+          </w:p>
+        </w:tc>
+        <w:tc>
+          <w:tcPr>
+            <w:tcW w:type="dxa" w:w="1455"/>
+            <w:vAlign w:val="center"/>
+          </w:tcPr>
+          <w:p>
+            <w:pPr>
+              <w:spacing w:line="276" w:lineRule="auto"/>
+              <w:jc w:val="center"/>
+            </w:pPr>
+            <w:r/>
+            <w:r>
+              <w:rPr>
+                <w:rFonts w:ascii="Times New Roman" w:hAnsi="Times New Roman" w:eastAsia="宋体"/>
+                <w:b w:val="0"/>
+                <w:sz w:val="17"/>
+              </w:rPr>
+              <w:t>0.9417</w:t>
+            </w:r>
+          </w:p>
+        </w:tc>
+        <w:tc>
+          <w:tcPr>
+            <w:tcW w:type="dxa" w:w="1455"/>
+            <w:vAlign w:val="center"/>
+          </w:tcPr>
+          <w:p>
+            <w:pPr>
+              <w:spacing w:line="276" w:lineRule="auto"/>
+              <w:jc w:val="center"/>
+            </w:pPr>
+            <w:r/>
+            <w:r>
+              <w:rPr>
+                <w:rFonts w:ascii="Times New Roman" w:hAnsi="Times New Roman" w:eastAsia="宋体"/>
+                <w:b w:val="0"/>
+                <w:sz w:val="17"/>
+              </w:rPr>
+              <w:t>0.9283</w:t>
+            </w:r>
+          </w:p>
+        </w:tc>
+        <w:tc>
+          <w:tcPr>
+            <w:tcW w:type="dxa" w:w="1455"/>
+            <w:vAlign w:val="center"/>
+          </w:tcPr>
+          <w:p>
+            <w:pPr>
+              <w:spacing w:line="276" w:lineRule="auto"/>
+              <w:jc w:val="center"/>
+            </w:pPr>
+            <w:r/>
+            <w:r>
+              <w:rPr>
+                <w:rFonts w:ascii="Times New Roman" w:hAnsi="Times New Roman" w:eastAsia="宋体"/>
+                <w:b w:val="0"/>
+                <w:sz w:val="17"/>
+              </w:rPr>
+              <w:t>0.9417</w:t>
+            </w:r>
+          </w:p>
+        </w:tc>
+        <w:tc>
+          <w:tcPr>
+            <w:tcW w:type="dxa" w:w="1455"/>
+            <w:vAlign w:val="center"/>
+          </w:tcPr>
+          <w:p>
+            <w:pPr>
+              <w:spacing w:line="276" w:lineRule="auto"/>
+              <w:jc w:val="center"/>
+            </w:pPr>
+            <w:r/>
+            <w:r>
+              <w:rPr>
+                <w:rFonts w:ascii="Times New Roman" w:hAnsi="Times New Roman" w:eastAsia="宋体"/>
+                <w:b w:val="0"/>
+                <w:sz w:val="17"/>
+              </w:rPr>
+              <w:t>0.9467</w:t>
+            </w:r>
+          </w:p>
+        </w:tc>
+      </w:tr>
+      <w:tr>
+        <w:tc>
+          <w:tcPr>
+            <w:tcW w:type="dxa" w:w="1455"/>
+            <w:vAlign w:val="center"/>
+          </w:tcPr>
+          <w:p>
+            <w:pPr>
+              <w:spacing w:line="276" w:lineRule="auto"/>
+              <w:jc w:val="center"/>
+            </w:pPr>
+            <w:r/>
+            <w:r>
+              <w:rPr>
+                <w:rFonts w:ascii="Times New Roman" w:hAnsi="Times New Roman" w:eastAsia="宋体"/>
+                <w:b w:val="0"/>
+                <w:sz w:val="17"/>
+              </w:rPr>
+              <w:t>ROME</w:t>
+            </w:r>
+          </w:p>
+        </w:tc>
+        <w:tc>
+          <w:tcPr>
+            <w:tcW w:type="dxa" w:w="1455"/>
+            <w:vAlign w:val="center"/>
+          </w:tcPr>
+          <w:p>
+            <w:pPr>
+              <w:spacing w:line="276" w:lineRule="auto"/>
+              <w:jc w:val="center"/>
+            </w:pPr>
+            <w:r/>
+            <w:r>
+              <w:rPr>
+                <w:rFonts w:ascii="Times New Roman" w:hAnsi="Times New Roman" w:eastAsia="宋体"/>
+                <w:b w:val="0"/>
+                <w:sz w:val="17"/>
+              </w:rPr>
+              <w:t>0.6367</w:t>
+            </w:r>
+          </w:p>
+        </w:tc>
+        <w:tc>
+          <w:tcPr>
+            <w:tcW w:type="dxa" w:w="1455"/>
+            <w:vAlign w:val="center"/>
+          </w:tcPr>
+          <w:p>
+            <w:pPr>
+              <w:spacing w:line="276" w:lineRule="auto"/>
+              <w:jc w:val="center"/>
+            </w:pPr>
+            <w:r/>
+            <w:r>
+              <w:rPr>
+                <w:rFonts w:ascii="Times New Roman" w:hAnsi="Times New Roman" w:eastAsia="宋体"/>
+                <w:b w:val="0"/>
+                <w:sz w:val="17"/>
+              </w:rPr>
+              <w:t>0.5367</w:t>
+            </w:r>
+          </w:p>
+        </w:tc>
+        <w:tc>
+          <w:tcPr>
+            <w:tcW w:type="dxa" w:w="1455"/>
+            <w:vAlign w:val="center"/>
+          </w:tcPr>
+          <w:p>
+            <w:pPr>
+              <w:spacing w:line="276" w:lineRule="auto"/>
+              <w:jc w:val="center"/>
+            </w:pPr>
+            <w:r/>
+            <w:r>
+              <w:rPr>
+                <w:rFonts w:ascii="Times New Roman" w:hAnsi="Times New Roman" w:eastAsia="宋体"/>
+                <w:b w:val="0"/>
+                <w:sz w:val="17"/>
+              </w:rPr>
+              <w:t>0.6383</w:t>
+            </w:r>
+          </w:p>
+        </w:tc>
+        <w:tc>
+          <w:tcPr>
+            <w:tcW w:type="dxa" w:w="1455"/>
+            <w:vAlign w:val="center"/>
+          </w:tcPr>
+          <w:p>
+            <w:pPr>
+              <w:spacing w:line="276" w:lineRule="auto"/>
+              <w:jc w:val="center"/>
+            </w:pPr>
+            <w:r/>
+            <w:r>
+              <w:rPr>
+                <w:rFonts w:ascii="Times New Roman" w:hAnsi="Times New Roman" w:eastAsia="宋体"/>
+                <w:b w:val="0"/>
+                <w:sz w:val="17"/>
+              </w:rPr>
+              <w:t>0.4383</w:t>
+            </w:r>
+          </w:p>
+        </w:tc>
+        <w:tc>
+          <w:tcPr>
+            <w:tcW w:type="dxa" w:w="1455"/>
+            <w:vAlign w:val="center"/>
+          </w:tcPr>
+          <w:p>
+            <w:pPr>
+              <w:spacing w:line="276" w:lineRule="auto"/>
+              <w:jc w:val="center"/>
+            </w:pPr>
+            <w:r/>
+            <w:r>
+              <w:rPr>
+                <w:rFonts w:ascii="Times New Roman" w:hAnsi="Times New Roman" w:eastAsia="宋体"/>
+                <w:b w:val="0"/>
+                <w:sz w:val="17"/>
+              </w:rPr>
+              <w:t>0.6433</w:t>
+            </w:r>
+          </w:p>
+        </w:tc>
+      </w:tr>
+      <w:tr>
+        <w:tc>
+          <w:tcPr>
+            <w:tcW w:type="dxa" w:w="1455"/>
+            <w:vAlign w:val="center"/>
+          </w:tcPr>
+          <w:p>
+            <w:pPr>
+              <w:spacing w:line="276" w:lineRule="auto"/>
+              <w:jc w:val="center"/>
+            </w:pPr>
+            <w:r/>
+            <w:r>
+              <w:rPr>
+                <w:rFonts w:ascii="Times New Roman" w:hAnsi="Times New Roman" w:eastAsia="宋体"/>
+                <w:b w:val="0"/>
+                <w:sz w:val="17"/>
+              </w:rPr>
+              <w:t>PACE</w:t>
+            </w:r>
+          </w:p>
+        </w:tc>
+        <w:tc>
+          <w:tcPr>
+            <w:tcW w:type="dxa" w:w="1455"/>
+            <w:vAlign w:val="center"/>
+          </w:tcPr>
+          <w:p>
+            <w:pPr>
+              <w:spacing w:line="276" w:lineRule="auto"/>
+              <w:jc w:val="center"/>
+            </w:pPr>
+            <w:r/>
+            <w:r>
+              <w:rPr>
+                <w:rFonts w:ascii="Times New Roman" w:hAnsi="Times New Roman" w:eastAsia="宋体"/>
+                <w:b w:val="0"/>
+                <w:sz w:val="17"/>
+              </w:rPr>
+              <w:t>0.0300</w:t>
+            </w:r>
+          </w:p>
+        </w:tc>
+        <w:tc>
+          <w:tcPr>
+            <w:tcW w:type="dxa" w:w="1455"/>
+            <w:vAlign w:val="center"/>
+          </w:tcPr>
+          <w:p>
+            <w:pPr>
+              <w:spacing w:line="276" w:lineRule="auto"/>
+              <w:jc w:val="center"/>
+            </w:pPr>
+            <w:r/>
+            <w:r>
+              <w:rPr>
+                <w:rFonts w:ascii="Times New Roman" w:hAnsi="Times New Roman" w:eastAsia="宋体"/>
+                <w:b w:val="0"/>
+                <w:sz w:val="17"/>
+              </w:rPr>
+              <w:t>0.0250</w:t>
+            </w:r>
+          </w:p>
+        </w:tc>
+        <w:tc>
+          <w:tcPr>
+            <w:tcW w:type="dxa" w:w="1455"/>
+            <w:vAlign w:val="center"/>
+          </w:tcPr>
+          <w:p>
+            <w:pPr>
+              <w:spacing w:line="276" w:lineRule="auto"/>
+              <w:jc w:val="center"/>
+            </w:pPr>
+            <w:r/>
+            <w:r>
+              <w:rPr>
+                <w:rFonts w:ascii="Times New Roman" w:hAnsi="Times New Roman" w:eastAsia="宋体"/>
+                <w:b w:val="0"/>
+                <w:sz w:val="17"/>
+              </w:rPr>
+              <w:t>0.0317</w:t>
+            </w:r>
+          </w:p>
+        </w:tc>
+        <w:tc>
+          <w:tcPr>
+            <w:tcW w:type="dxa" w:w="1455"/>
+            <w:vAlign w:val="center"/>
+          </w:tcPr>
+          <w:p>
+            <w:pPr>
+              <w:spacing w:line="276" w:lineRule="auto"/>
+              <w:jc w:val="center"/>
+            </w:pPr>
+            <w:r/>
+            <w:r>
+              <w:rPr>
+                <w:rFonts w:ascii="Times New Roman" w:hAnsi="Times New Roman" w:eastAsia="宋体"/>
+                <w:b w:val="0"/>
+                <w:sz w:val="17"/>
+              </w:rPr>
+              <w:t>0.0000</w:t>
+            </w:r>
+          </w:p>
+        </w:tc>
+        <w:tc>
+          <w:tcPr>
+            <w:tcW w:type="dxa" w:w="1455"/>
+            <w:vAlign w:val="center"/>
+          </w:tcPr>
+          <w:p>
+            <w:pPr>
+              <w:spacing w:line="276" w:lineRule="auto"/>
+              <w:jc w:val="center"/>
+            </w:pPr>
+            <w:r/>
+            <w:r>
+              <w:rPr>
+                <w:rFonts w:ascii="Times New Roman" w:hAnsi="Times New Roman" w:eastAsia="宋体"/>
+                <w:b w:val="0"/>
+                <w:sz w:val="17"/>
+              </w:rPr>
+              <w:t>0.0350</w:t>
+            </w:r>
+          </w:p>
+        </w:tc>
+      </w:tr>
+    </w:tbl>
+    <w:p/>
+    <w:p>
+      <w:pPr>
+        <w:spacing w:line="360" w:lineRule="auto" w:before="0" w:after="0"/>
+        <w:ind w:firstLine="480"/>
+      </w:pPr>
+      <w:r>
+        <w:rPr>
+          <w:rFonts w:ascii="Times New Roman" w:hAnsi="Times New Roman" w:eastAsia="宋体"/>
+          <w:b w:val="0"/>
+          <w:sz w:val="24"/>
+        </w:rPr>
+        <w:t>结果观察显示，编辑前模型在五类攻击提示下均保持较高泄露水平，说明泄露不是某一个模板偶然造成的。ROME 对 roleplay 和 paraphrase 的压制相对更强，但 direct、completion 和 context 仍有较高残余泄露。PACE 在五类攻击上均将隐私值包含率压到较低水平，但结合第 4.5 节可知，这种压制伴随明显 public refusal。该分析支撑了本文的核心判断：闭环再编辑确实扩大了攻击覆盖，但必须配合公开知识约束来控制副作用。</w:t>
+      </w:r>
+    </w:p>
+    <w:p>
+      <w:pPr>
+        <w:pStyle w:val="Heading2"/>
+        <w:spacing w:before="200" w:after="120"/>
+      </w:pPr>
+      <w:r>
+        <w:rPr>
+          <w:rFonts w:ascii="Times New Roman" w:hAnsi="Times New Roman" w:eastAsia="黑体"/>
+          <w:b/>
+          <w:sz w:val="28"/>
+        </w:rPr>
+        <w:t>4.9  Qwen 公开事实编辑迁移验证</w:t>
+      </w:r>
+    </w:p>
+    <w:p>
+      <w:pPr>
+        <w:spacing w:line="360" w:lineRule="auto" w:before="0" w:after="0"/>
+        <w:ind w:firstLine="480"/>
+      </w:pPr>
+      <w:r>
+        <w:rPr>
+          <w:rFonts w:ascii="Times New Roman" w:hAnsi="Times New Roman" w:eastAsia="宋体"/>
+          <w:b w:val="0"/>
+          <w:sz w:val="24"/>
+        </w:rPr>
+        <w:t>CounterFact 和 zsRE 是公开事实编辑数据集，不是隐私清洗数据集。本文使用它们的目的，是检查 PACE/CAPE 这种 closed-loop request selection 是否能在公开 factual editing 场景中运行，并观察其 reliability 与 generalization 表现。表 7 给出 Qwen 上的 public transfer 结果。</w:t>
+      </w:r>
+    </w:p>
+    <w:p>
+      <w:pPr>
+        <w:spacing w:line="360" w:lineRule="auto" w:before="0" w:after="0"/>
+        <w:jc w:val="center"/>
+      </w:pPr>
+      <w:r>
+        <w:rPr>
+          <w:rFonts w:ascii="Times New Roman" w:hAnsi="Times New Roman" w:eastAsia="宋体"/>
+          <w:b w:val="0"/>
+          <w:sz w:val="21"/>
+        </w:rPr>
+        <w:t>表 7  Qwen 公开事实编辑迁移验证结果</w:t>
       </w:r>
     </w:p>
     <w:tbl>
@@ -6225,20 +7546,7 @@
     </w:p>
     <w:p>
       <w:pPr>
-        <w:spacing w:line="360" w:lineRule="auto" w:before="0" w:after="0"/>
-        <w:jc w:val="center"/>
-      </w:pPr>
-      <w:r>
-        <w:rPr>
-          <w:rFonts w:ascii="Times New Roman" w:hAnsi="Times New Roman" w:eastAsia="宋体"/>
-          <w:b w:val="0"/>
-          <w:sz w:val="21"/>
-        </w:rPr>
-        <w:t>图 5  Qwen 公开迁移结果对比</w:t>
-      </w:r>
-    </w:p>
-    <w:p>
-      <w:pPr>
+        <w:keepNext/>
         <w:jc w:val="center"/>
       </w:pPr>
       <w:r>
@@ -6287,6 +7595,20 @@
           <w:b w:val="0"/>
           <w:sz w:val="21"/>
         </w:rPr>
+        <w:t>图 5  Qwen 公开迁移结果对比</w:t>
+      </w:r>
+    </w:p>
+    <w:p>
+      <w:pPr>
+        <w:spacing w:line="360" w:lineRule="auto" w:before="0" w:after="0"/>
+        <w:jc w:val="center"/>
+      </w:pPr>
+      <w:r>
+        <w:rPr>
+          <w:rFonts w:ascii="Times New Roman" w:hAnsi="Times New Roman" w:eastAsia="宋体"/>
+          <w:b w:val="0"/>
+          <w:sz w:val="21"/>
+        </w:rPr>
         <w:t>图 5 的作用是把 Qwen public wrapper 与基础方法放在同一 public editing 语境中比较。它服务的不是隐私清洗主张，而是外部迁移验证：本文方法并非只能在自造数据上运行，但公开事实编辑结果仍不足以支撑“通用提升”的强结论。</w:t>
       </w:r>
     </w:p>
@@ -6301,7 +7623,7 @@
           <w:b/>
           <w:sz w:val="28"/>
         </w:rPr>
-        <w:t>4.9  GPT-J 第二模型边界验证</w:t>
+        <w:t>4.10  GPT-J 第二模型边界验证</w:t>
       </w:r>
     </w:p>
     <w:p>
@@ -6329,7 +7651,7 @@
           <w:b w:val="0"/>
           <w:sz w:val="21"/>
         </w:rPr>
-        <w:t>表 6  GPT-J 第二模型边界验证结果</w:t>
+        <w:t>表 8  GPT-J 第二模型边界验证结果</w:t>
       </w:r>
     </w:p>
     <w:tbl>
@@ -7524,20 +8846,7 @@
     </w:p>
     <w:p>
       <w:pPr>
-        <w:spacing w:line="360" w:lineRule="auto" w:before="0" w:after="0"/>
-        <w:jc w:val="center"/>
-      </w:pPr>
-      <w:r>
-        <w:rPr>
-          <w:rFonts w:ascii="Times New Roman" w:hAnsi="Times New Roman" w:eastAsia="宋体"/>
-          <w:b w:val="0"/>
-          <w:sz w:val="21"/>
-        </w:rPr>
-        <w:t>图 6  GPT-J wrapper collapse 边界验证图</w:t>
-      </w:r>
-    </w:p>
-    <w:p>
-      <w:pPr>
+        <w:keepNext/>
         <w:jc w:val="center"/>
       </w:pPr>
       <w:r>
@@ -7586,6 +8895,20 @@
           <w:b w:val="0"/>
           <w:sz w:val="21"/>
         </w:rPr>
+        <w:t>图 6  GPT-J wrapper collapse 边界验证图</w:t>
+      </w:r>
+    </w:p>
+    <w:p>
+      <w:pPr>
+        <w:spacing w:line="360" w:lineRule="auto" w:before="0" w:after="0"/>
+        <w:jc w:val="center"/>
+      </w:pPr>
+      <w:r>
+        <w:rPr>
+          <w:rFonts w:ascii="Times New Roman" w:hAnsi="Times New Roman" w:eastAsia="宋体"/>
+          <w:b w:val="0"/>
+          <w:sz w:val="21"/>
+        </w:rPr>
         <w:t>图 6 展示的不是负面异常，而是方法边界。它说明 GPT-J 模型本身和 ROME/FT baseline 并未损坏，问题集中在未调参 wrapper 与 GPT-J 编辑超参数的耦合上。因此，GPT-J 结果应写作边界证据，而不应否定 Qwen synthetic privacy 主实验。</w:t>
       </w:r>
     </w:p>
@@ -7600,7 +8923,7 @@
           <w:b/>
           <w:sz w:val="28"/>
         </w:rPr>
-        <w:t>4.10  失败项与资源限制分析</w:t>
+        <w:t>4.11  失败项与资源限制分析</w:t>
       </w:r>
     </w:p>
     <w:p>
@@ -7614,7 +8937,7 @@
           <w:b w:val="0"/>
           <w:sz w:val="21"/>
         </w:rPr>
-        <w:t>表 7 汇总资源限制和方法边界项。KN 在部分设置中受到 48GB 显存限制，IKE 依赖句向量模型但当前环境缺少对应本地依赖；GPT-J wrapper 虽然运行完成，但作为边界结果而非正向有效结果处理。这些条目不应被隐藏，也不应被当作有效 0 值。</w:t>
+        <w:t>表 9 汇总资源限制和方法边界项。KN 在部分设置中受到 48GB 显存限制，IKE 依赖句向量模型但当前环境缺少对应本地依赖；GPT-J wrapper 虽然运行完成，但作为边界结果而非正向有效结果处理。这些条目不应被隐藏，也不应被当作有效 0 值。</w:t>
       </w:r>
     </w:p>
     <w:p>
@@ -7628,7 +8951,7 @@
           <w:b w:val="0"/>
           <w:sz w:val="21"/>
         </w:rPr>
-        <w:t>表 7  失败项与资源限制分析</w:t>
+        <w:t>表 9  失败项与资源限制分析</w:t>
       </w:r>
     </w:p>
     <w:tbl>
@@ -7818,7 +9141,7 @@
                 <w:b w:val="0"/>
                 <w:sz w:val="17"/>
               </w:rPr>
-              <w:t>failed</w:t>
+              <w:t>未完成</w:t>
             </w:r>
           </w:p>
         </w:tc>
@@ -7839,7 +9162,7 @@
                 <w:b w:val="0"/>
                 <w:sz w:val="17"/>
               </w:rPr>
-              <w:t>OOM on 48GB GPU</w:t>
+              <w:t>48GB 显存下仍出现 OOM</w:t>
             </w:r>
           </w:p>
         </w:tc>
@@ -7851,16 +9174,16 @@
           <w:p>
             <w:pPr>
               <w:spacing w:line="276" w:lineRule="auto"/>
-              <w:jc w:val="left"/>
-            </w:pPr>
-            <w:r/>
-            <w:r>
-              <w:rPr>
-                <w:rFonts w:ascii="Times New Roman" w:hAnsi="Times New Roman" w:eastAsia="宋体"/>
-                <w:b w:val="0"/>
-                <w:sz w:val="17"/>
-              </w:rPr>
-              <w:t>record and do not rerun</w:t>
+              <w:jc w:val="center"/>
+            </w:pPr>
+            <w:r/>
+            <w:r>
+              <w:rPr>
+                <w:rFonts w:ascii="Times New Roman" w:hAnsi="Times New Roman" w:eastAsia="宋体"/>
+                <w:b w:val="0"/>
+                <w:sz w:val="17"/>
+              </w:rPr>
+              <w:t>记录原因，不再重复运行</w:t>
             </w:r>
           </w:p>
         </w:tc>
@@ -7925,7 +9248,7 @@
                 <w:b w:val="0"/>
                 <w:sz w:val="17"/>
               </w:rPr>
-              <w:t>failed</w:t>
+              <w:t>未完成</w:t>
             </w:r>
           </w:p>
         </w:tc>
@@ -7937,16 +9260,16 @@
           <w:p>
             <w:pPr>
               <w:spacing w:line="276" w:lineRule="auto"/>
-              <w:jc w:val="left"/>
-            </w:pPr>
-            <w:r/>
-            <w:r>
-              <w:rPr>
-                <w:rFonts w:ascii="Times New Roman" w:hAnsi="Times New Roman" w:eastAsia="宋体"/>
-                <w:b w:val="0"/>
-                <w:sz w:val="17"/>
-              </w:rPr>
-              <w:t>missing SentenceTransformer dependency</w:t>
+              <w:jc w:val="center"/>
+            </w:pPr>
+            <w:r/>
+            <w:r>
+              <w:rPr>
+                <w:rFonts w:ascii="Times New Roman" w:hAnsi="Times New Roman" w:eastAsia="宋体"/>
+                <w:b w:val="0"/>
+                <w:sz w:val="17"/>
+              </w:rPr>
+              <w:t>句向量模型依赖缺失</w:t>
             </w:r>
           </w:p>
         </w:tc>
@@ -7958,16 +9281,16 @@
           <w:p>
             <w:pPr>
               <w:spacing w:line="276" w:lineRule="auto"/>
-              <w:jc w:val="left"/>
-            </w:pPr>
-            <w:r/>
-            <w:r>
-              <w:rPr>
-                <w:rFonts w:ascii="Times New Roman" w:hAnsi="Times New Roman" w:eastAsia="宋体"/>
-                <w:b w:val="0"/>
-                <w:sz w:val="17"/>
-              </w:rPr>
-              <w:t>record and do not rerun</w:t>
+              <w:jc w:val="center"/>
+            </w:pPr>
+            <w:r/>
+            <w:r>
+              <w:rPr>
+                <w:rFonts w:ascii="Times New Roman" w:hAnsi="Times New Roman" w:eastAsia="宋体"/>
+                <w:b w:val="0"/>
+                <w:sz w:val="17"/>
+              </w:rPr>
+              <w:t>记录原因，不再重复运行</w:t>
             </w:r>
           </w:p>
         </w:tc>
@@ -7990,7 +9313,7 @@
                 <w:b w:val="0"/>
                 <w:sz w:val="17"/>
               </w:rPr>
-              <w:t>Qwen public counterfact</w:t>
+              <w:t>Qwen public CounterFact</w:t>
             </w:r>
           </w:p>
         </w:tc>
@@ -8032,7 +9355,7 @@
                 <w:b w:val="0"/>
                 <w:sz w:val="17"/>
               </w:rPr>
-              <w:t>failed</w:t>
+              <w:t>未完成</w:t>
             </w:r>
           </w:p>
         </w:tc>
@@ -8044,16 +9367,16 @@
           <w:p>
             <w:pPr>
               <w:spacing w:line="276" w:lineRule="auto"/>
-              <w:jc w:val="left"/>
-            </w:pPr>
-            <w:r/>
-            <w:r>
-              <w:rPr>
-                <w:rFonts w:ascii="Times New Roman" w:hAnsi="Times New Roman" w:eastAsia="宋体"/>
-                <w:b w:val="0"/>
-                <w:sz w:val="17"/>
-              </w:rPr>
-              <w:t>missing SentenceTransformer dependency</w:t>
+              <w:jc w:val="center"/>
+            </w:pPr>
+            <w:r/>
+            <w:r>
+              <w:rPr>
+                <w:rFonts w:ascii="Times New Roman" w:hAnsi="Times New Roman" w:eastAsia="宋体"/>
+                <w:b w:val="0"/>
+                <w:sz w:val="17"/>
+              </w:rPr>
+              <w:t>句向量模型依赖缺失</w:t>
             </w:r>
           </w:p>
         </w:tc>
@@ -8065,16 +9388,16 @@
           <w:p>
             <w:pPr>
               <w:spacing w:line="276" w:lineRule="auto"/>
-              <w:jc w:val="left"/>
-            </w:pPr>
-            <w:r/>
-            <w:r>
-              <w:rPr>
-                <w:rFonts w:ascii="Times New Roman" w:hAnsi="Times New Roman" w:eastAsia="宋体"/>
-                <w:b w:val="0"/>
-                <w:sz w:val="17"/>
-              </w:rPr>
-              <w:t>record as resource/dependency limit</w:t>
+              <w:jc w:val="center"/>
+            </w:pPr>
+            <w:r/>
+            <w:r>
+              <w:rPr>
+                <w:rFonts w:ascii="Times New Roman" w:hAnsi="Times New Roman" w:eastAsia="宋体"/>
+                <w:b w:val="0"/>
+                <w:sz w:val="17"/>
+              </w:rPr>
+              <w:t>记录为资源或依赖限制</w:t>
             </w:r>
           </w:p>
         </w:tc>
@@ -8097,7 +9420,7 @@
                 <w:b w:val="0"/>
                 <w:sz w:val="17"/>
               </w:rPr>
-              <w:t>Qwen public zsre</w:t>
+              <w:t>Qwen public zsRE</w:t>
             </w:r>
           </w:p>
         </w:tc>
@@ -8139,7 +9462,7 @@
                 <w:b w:val="0"/>
                 <w:sz w:val="17"/>
               </w:rPr>
-              <w:t>failed</w:t>
+              <w:t>未完成</w:t>
             </w:r>
           </w:p>
         </w:tc>
@@ -8160,7 +9483,7 @@
                 <w:b w:val="0"/>
                 <w:sz w:val="17"/>
               </w:rPr>
-              <w:t>OOM on 48GB GPU</w:t>
+              <w:t>48GB 显存下仍出现 OOM</w:t>
             </w:r>
           </w:p>
         </w:tc>
@@ -8172,16 +9495,16 @@
           <w:p>
             <w:pPr>
               <w:spacing w:line="276" w:lineRule="auto"/>
-              <w:jc w:val="left"/>
-            </w:pPr>
-            <w:r/>
-            <w:r>
-              <w:rPr>
-                <w:rFonts w:ascii="Times New Roman" w:hAnsi="Times New Roman" w:eastAsia="宋体"/>
-                <w:b w:val="0"/>
-                <w:sz w:val="17"/>
-              </w:rPr>
-              <w:t>record as resource/dependency limit</w:t>
+              <w:jc w:val="center"/>
+            </w:pPr>
+            <w:r/>
+            <w:r>
+              <w:rPr>
+                <w:rFonts w:ascii="Times New Roman" w:hAnsi="Times New Roman" w:eastAsia="宋体"/>
+                <w:b w:val="0"/>
+                <w:sz w:val="17"/>
+              </w:rPr>
+              <w:t>记录为资源或依赖限制</w:t>
             </w:r>
           </w:p>
         </w:tc>
@@ -8225,7 +9548,7 @@
                 <w:b w:val="0"/>
                 <w:sz w:val="17"/>
               </w:rPr>
-              <w:t>ROME_PACE_EDIT / ROME_CAPE_EDIT</w:t>
+              <w:t>PACE/CAPE wrapper</w:t>
             </w:r>
           </w:p>
         </w:tc>
@@ -8237,6 +9560,27 @@
           <w:p>
             <w:pPr>
               <w:spacing w:line="276" w:lineRule="auto"/>
+              <w:jc w:val="center"/>
+            </w:pPr>
+            <w:r/>
+            <w:r>
+              <w:rPr>
+                <w:rFonts w:ascii="Times New Roman" w:hAnsi="Times New Roman" w:eastAsia="宋体"/>
+                <w:b w:val="0"/>
+                <w:sz w:val="17"/>
+              </w:rPr>
+              <w:t>已运行但为负结果</w:t>
+            </w:r>
+          </w:p>
+        </w:tc>
+        <w:tc>
+          <w:tcPr>
+            <w:tcW w:type="dxa" w:w="1746"/>
+            <w:vAlign w:val="center"/>
+          </w:tcPr>
+          <w:p>
+            <w:pPr>
+              <w:spacing w:line="276" w:lineRule="auto"/>
               <w:jc w:val="left"/>
             </w:pPr>
             <w:r/>
@@ -8246,7 +9590,7 @@
                 <w:b w:val="0"/>
                 <w:sz w:val="17"/>
               </w:rPr>
-              <w:t>ok run, negative result</w:t>
+              <w:t>逐样本审计确认 wrapper 塌缩，不是路径混用</w:t>
             </w:r>
           </w:p>
         </w:tc>
@@ -8267,28 +9611,7 @@
                 <w:b w:val="0"/>
                 <w:sz w:val="17"/>
               </w:rPr>
-              <w:t>per-case audit confirms wrapper collapse, not path mixup</w:t>
-            </w:r>
-          </w:p>
-        </w:tc>
-        <w:tc>
-          <w:tcPr>
-            <w:tcW w:type="dxa" w:w="1746"/>
-            <w:vAlign w:val="center"/>
-          </w:tcPr>
-          <w:p>
-            <w:pPr>
-              <w:spacing w:line="276" w:lineRule="auto"/>
-              <w:jc w:val="left"/>
-            </w:pPr>
-            <w:r/>
-            <w:r>
-              <w:rPr>
-                <w:rFonts w:ascii="Times New Roman" w:hAnsi="Times New Roman" w:eastAsia="宋体"/>
-                <w:b w:val="0"/>
-                <w:sz w:val="17"/>
-              </w:rPr>
-              <w:t>boundary analysis, no GPU rerun</w:t>
+              <w:t>作为边界分析，不再消耗 GPU 重跑</w:t>
             </w:r>
           </w:p>
         </w:tc>
@@ -8306,7 +9629,7 @@
           <w:b w:val="0"/>
           <w:sz w:val="21"/>
         </w:rPr>
-        <w:t>表 7 的作用是明确实验矩阵中哪些结果可比较、哪些结果只能作为资源或迁移边界。对于课程论文而言，如实报告失败项比强行补齐不可承受的矩阵更可靠，也能避免把资源受限误解释为算法优劣。</w:t>
+        <w:t>表 9 的作用是明确实验矩阵中哪些结果可比较、哪些结果只能作为资源或迁移边界。对于课程论文而言，如实报告失败项比强行补齐不可承受的矩阵更可靠，也能避免把资源受限误解释为算法优劣。</w:t>
       </w:r>
     </w:p>
     <w:p>
@@ -8320,7 +9643,7 @@
           <w:b/>
           <w:sz w:val="28"/>
         </w:rPr>
-        <w:t>4.11  典型案例分析</w:t>
+        <w:t>4.12  典型案例分析</w:t>
       </w:r>
     </w:p>
     <w:p>
@@ -8362,7 +9685,7 @@
           <w:b/>
           <w:sz w:val="28"/>
         </w:rPr>
-        <w:t>4.12  本章小结</w:t>
+        <w:t>4.13  本章小结</w:t>
       </w:r>
     </w:p>
     <w:p>
@@ -8424,20 +9747,7 @@
     </w:p>
     <w:p>
       <w:pPr>
-        <w:spacing w:line="360" w:lineRule="auto" w:before="0" w:after="0"/>
-        <w:jc w:val="center"/>
-      </w:pPr>
-      <w:r>
-        <w:rPr>
-          <w:rFonts w:ascii="Times New Roman" w:hAnsi="Times New Roman" w:eastAsia="宋体"/>
-          <w:b w:val="0"/>
-          <w:sz w:val="21"/>
-        </w:rPr>
-        <w:t>图 7  系统模块与结果归档流程</w:t>
-      </w:r>
-    </w:p>
-    <w:p>
-      <w:pPr>
+        <w:keepNext/>
         <w:jc w:val="center"/>
       </w:pPr>
       <w:r>
@@ -8486,6 +9796,20 @@
           <w:b w:val="0"/>
           <w:sz w:val="21"/>
         </w:rPr>
+        <w:t>图 7  系统模块与结果归档流程</w:t>
+      </w:r>
+    </w:p>
+    <w:p>
+      <w:pPr>
+        <w:spacing w:line="360" w:lineRule="auto" w:before="0" w:after="0"/>
+        <w:jc w:val="center"/>
+      </w:pPr>
+      <w:r>
+        <w:rPr>
+          <w:rFonts w:ascii="Times New Roman" w:hAnsi="Times New Roman" w:eastAsia="宋体"/>
+          <w:b w:val="0"/>
+          <w:sz w:val="21"/>
+        </w:rPr>
         <w:t>图 7 展示了系统从数据到论文结果的闭环。该流程的关键不是堆叠工具，而是保证同一 case_id、请求集合、评估输出和结果表之间可以互相追溯，从而降低多轮实验中的状态漂移。</w:t>
       </w:r>
     </w:p>
@@ -8584,7 +9908,7 @@
           <w:b/>
           <w:sz w:val="28"/>
         </w:rPr>
-        <w:t>5.5  实验平台与运行环境</w:t>
+        <w:t>5.5  实验环境与版本管理</w:t>
       </w:r>
     </w:p>
     <w:p>
@@ -8612,7 +9936,7 @@
           <w:b/>
           <w:sz w:val="28"/>
         </w:rPr>
-        <w:t>5.6  代码组织与可复现性说明</w:t>
+        <w:t>5.6  可复现性设计</w:t>
       </w:r>
     </w:p>
     <w:p>
@@ -11709,6 +13033,8 @@
       <w:jc w:val="both"/>
     </w:pPr>
     <w:rPr>
+      <w:rFonts w:ascii="Times New Roman" w:hAnsi="Times New Roman" w:eastAsia="宋体"/>
+      <w:sz w:val="24"/>
       <w:szCs w:val="24"/>
     </w:rPr>
   </w:style>
@@ -11727,10 +13053,11 @@
       <w:outlineLvl w:val="0"/>
     </w:pPr>
     <w:rPr>
+      <w:rFonts w:ascii="Times New Roman" w:hAnsi="Times New Roman" w:eastAsia="黑体"/>
       <w:b/>
       <w:bCs/>
       <w:kern w:val="44"/>
-      <w:sz w:val="44"/>
+      <w:sz w:val="32"/>
       <w:szCs w:val="44"/>
     </w:rPr>
   </w:style>
@@ -11749,10 +13076,10 @@
       <w:outlineLvl w:val="1"/>
     </w:pPr>
     <w:rPr>
-      <w:rFonts w:ascii="Arial" w:eastAsia="黑体" w:hAnsi="Arial"/>
+      <w:rFonts w:ascii="Times New Roman" w:eastAsia="黑体" w:hAnsi="Times New Roman"/>
       <w:b/>
       <w:bCs/>
-      <w:sz w:val="32"/>
+      <w:sz w:val="28"/>
       <w:szCs w:val="32"/>
     </w:rPr>
   </w:style>

</xml_diff>